<commit_message>
Programming lab2 preparation finished
</commit_message>
<xml_diff>
--- a/programming/lab2/report.docx
+++ b/programming/lab2/report.docx
@@ -305,7 +305,7 @@
           <w:r>
             <w:fldChar w:fldCharType="separate"/>
           </w:r>
-          <w:hyperlink w:anchor="_Toc209088592" w:history="1">
+          <w:hyperlink w:anchor="_Toc210854119" w:history="1">
             <w:r>
               <w:rPr>
                 <w:rStyle w:val="Hyperlink"/>
@@ -334,7 +334,7 @@
                 <w:noProof/>
                 <w:webHidden/>
               </w:rPr>
-              <w:instrText xml:space="preserve"> PAGEREF _Toc209088592 \h </w:instrText>
+              <w:instrText xml:space="preserve"> PAGEREF _Toc210854119 \h </w:instrText>
             </w:r>
             <w:r>
               <w:rPr>
@@ -378,7 +378,7 @@
               <w:lang w:val="en-RU" w:eastAsia="en-GB"/>
             </w:rPr>
           </w:pPr>
-          <w:hyperlink w:anchor="_Toc209088593" w:history="1">
+          <w:hyperlink w:anchor="_Toc210854120" w:history="1">
             <w:r>
               <w:rPr>
                 <w:rStyle w:val="Hyperlink"/>
@@ -407,7 +407,7 @@
                 <w:noProof/>
                 <w:webHidden/>
               </w:rPr>
-              <w:instrText xml:space="preserve"> PAGEREF _Toc209088593 \h </w:instrText>
+              <w:instrText xml:space="preserve"> PAGEREF _Toc210854120 \h </w:instrText>
             </w:r>
             <w:r>
               <w:rPr>
@@ -427,7 +427,251 @@
                 <w:noProof/>
                 <w:webHidden/>
               </w:rPr>
-              <w:t>4</w:t>
+              <w:t>5</w:t>
+            </w:r>
+            <w:r>
+              <w:rPr>
+                <w:noProof/>
+                <w:webHidden/>
+              </w:rPr>
+              <w:fldChar w:fldCharType="end"/>
+            </w:r>
+          </w:hyperlink>
+        </w:p>
+        <w:p>
+          <w:pPr>
+            <w:pStyle w:val="TOC2"/>
+            <w:tabs>
+              <w:tab w:val="right" w:leader="dot" w:pos="9344"/>
+            </w:tabs>
+            <w:rPr>
+              <w:rFonts w:asciiTheme="minorHAnsi" w:eastAsiaTheme="minorEastAsia" w:hAnsiTheme="minorHAnsi"/>
+              <w:noProof/>
+              <w:sz w:val="24"/>
+              <w:lang w:val="en-RU" w:eastAsia="en-GB"/>
+            </w:rPr>
+          </w:pPr>
+          <w:hyperlink w:anchor="_Toc210854121" w:history="1">
+            <w:r>
+              <w:rPr>
+                <w:rStyle w:val="Hyperlink"/>
+                <w:noProof/>
+              </w:rPr>
+              <w:t>Исходный код</w:t>
+            </w:r>
+            <w:r>
+              <w:rPr>
+                <w:noProof/>
+                <w:webHidden/>
+              </w:rPr>
+              <w:tab/>
+            </w:r>
+            <w:r>
+              <w:rPr>
+                <w:noProof/>
+                <w:webHidden/>
+              </w:rPr>
+              <w:fldChar w:fldCharType="begin"/>
+            </w:r>
+            <w:r>
+              <w:rPr>
+                <w:noProof/>
+                <w:webHidden/>
+              </w:rPr>
+              <w:instrText xml:space="preserve"> PAGEREF _Toc210854121 \h </w:instrText>
+            </w:r>
+            <w:r>
+              <w:rPr>
+                <w:noProof/>
+                <w:webHidden/>
+              </w:rPr>
+            </w:r>
+            <w:r>
+              <w:rPr>
+                <w:noProof/>
+                <w:webHidden/>
+              </w:rPr>
+              <w:fldChar w:fldCharType="separate"/>
+            </w:r>
+            <w:r>
+              <w:rPr>
+                <w:noProof/>
+                <w:webHidden/>
+              </w:rPr>
+              <w:t>5</w:t>
+            </w:r>
+            <w:r>
+              <w:rPr>
+                <w:noProof/>
+                <w:webHidden/>
+              </w:rPr>
+              <w:fldChar w:fldCharType="end"/>
+            </w:r>
+          </w:hyperlink>
+        </w:p>
+        <w:p>
+          <w:pPr>
+            <w:pStyle w:val="TOC2"/>
+            <w:tabs>
+              <w:tab w:val="right" w:leader="dot" w:pos="9344"/>
+            </w:tabs>
+            <w:rPr>
+              <w:rFonts w:asciiTheme="minorHAnsi" w:eastAsiaTheme="minorEastAsia" w:hAnsiTheme="minorHAnsi"/>
+              <w:noProof/>
+              <w:sz w:val="24"/>
+              <w:lang w:val="en-RU" w:eastAsia="en-GB"/>
+            </w:rPr>
+          </w:pPr>
+          <w:hyperlink w:anchor="_Toc210854122" w:history="1">
+            <w:r>
+              <w:rPr>
+                <w:rStyle w:val="Hyperlink"/>
+                <w:noProof/>
+                <w:lang w:val="en-RU"/>
+              </w:rPr>
+              <w:t>Диаграмма классов реализованной объектной модели</w:t>
+            </w:r>
+            <w:r>
+              <w:rPr>
+                <w:noProof/>
+                <w:webHidden/>
+              </w:rPr>
+              <w:tab/>
+            </w:r>
+            <w:r>
+              <w:rPr>
+                <w:noProof/>
+                <w:webHidden/>
+              </w:rPr>
+              <w:fldChar w:fldCharType="begin"/>
+            </w:r>
+            <w:r>
+              <w:rPr>
+                <w:noProof/>
+                <w:webHidden/>
+              </w:rPr>
+              <w:instrText xml:space="preserve"> PAGEREF _Toc210854122 \h </w:instrText>
+            </w:r>
+            <w:r>
+              <w:rPr>
+                <w:noProof/>
+                <w:webHidden/>
+              </w:rPr>
+            </w:r>
+            <w:r>
+              <w:rPr>
+                <w:noProof/>
+                <w:webHidden/>
+              </w:rPr>
+              <w:fldChar w:fldCharType="separate"/>
+            </w:r>
+            <w:r>
+              <w:rPr>
+                <w:noProof/>
+                <w:webHidden/>
+              </w:rPr>
+              <w:t>6</w:t>
+            </w:r>
+            <w:r>
+              <w:rPr>
+                <w:noProof/>
+                <w:webHidden/>
+              </w:rPr>
+              <w:fldChar w:fldCharType="end"/>
+            </w:r>
+          </w:hyperlink>
+        </w:p>
+        <w:p>
+          <w:pPr>
+            <w:pStyle w:val="TOC2"/>
+            <w:tabs>
+              <w:tab w:val="right" w:leader="dot" w:pos="9344"/>
+            </w:tabs>
+            <w:rPr>
+              <w:rFonts w:asciiTheme="minorHAnsi" w:eastAsiaTheme="minorEastAsia" w:hAnsiTheme="minorHAnsi"/>
+              <w:noProof/>
+              <w:sz w:val="24"/>
+              <w:lang w:val="en-RU" w:eastAsia="en-GB"/>
+            </w:rPr>
+          </w:pPr>
+          <w:hyperlink w:anchor="_Toc210854123" w:history="1">
+            <w:r>
+              <w:rPr>
+                <w:rStyle w:val="Hyperlink"/>
+                <w:noProof/>
+              </w:rPr>
+              <w:t>Результат</w:t>
+            </w:r>
+            <w:r>
+              <w:rPr>
+                <w:rStyle w:val="Hyperlink"/>
+                <w:noProof/>
+                <w:lang w:val="en-US"/>
+              </w:rPr>
+              <w:t xml:space="preserve"> </w:t>
+            </w:r>
+            <w:r>
+              <w:rPr>
+                <w:rStyle w:val="Hyperlink"/>
+                <w:noProof/>
+              </w:rPr>
+              <w:t>работы</w:t>
+            </w:r>
+            <w:r>
+              <w:rPr>
+                <w:rStyle w:val="Hyperlink"/>
+                <w:noProof/>
+                <w:lang w:val="en-US"/>
+              </w:rPr>
+              <w:t xml:space="preserve"> </w:t>
+            </w:r>
+            <w:r>
+              <w:rPr>
+                <w:rStyle w:val="Hyperlink"/>
+                <w:noProof/>
+              </w:rPr>
+              <w:t>программы</w:t>
+            </w:r>
+            <w:r>
+              <w:rPr>
+                <w:noProof/>
+                <w:webHidden/>
+              </w:rPr>
+              <w:tab/>
+            </w:r>
+            <w:r>
+              <w:rPr>
+                <w:noProof/>
+                <w:webHidden/>
+              </w:rPr>
+              <w:fldChar w:fldCharType="begin"/>
+            </w:r>
+            <w:r>
+              <w:rPr>
+                <w:noProof/>
+                <w:webHidden/>
+              </w:rPr>
+              <w:instrText xml:space="preserve"> PAGEREF _Toc210854123 \h </w:instrText>
+            </w:r>
+            <w:r>
+              <w:rPr>
+                <w:noProof/>
+                <w:webHidden/>
+              </w:rPr>
+            </w:r>
+            <w:r>
+              <w:rPr>
+                <w:noProof/>
+                <w:webHidden/>
+              </w:rPr>
+              <w:fldChar w:fldCharType="separate"/>
+            </w:r>
+            <w:r>
+              <w:rPr>
+                <w:noProof/>
+                <w:webHidden/>
+              </w:rPr>
+              <w:t>7</w:t>
             </w:r>
             <w:r>
               <w:rPr>
@@ -451,7 +695,7 @@
               <w:lang w:val="en-RU" w:eastAsia="en-GB"/>
             </w:rPr>
           </w:pPr>
-          <w:hyperlink w:anchor="_Toc209088594" w:history="1">
+          <w:hyperlink w:anchor="_Toc210854124" w:history="1">
             <w:r>
               <w:rPr>
                 <w:rStyle w:val="Hyperlink"/>
@@ -480,7 +724,7 @@
                 <w:noProof/>
                 <w:webHidden/>
               </w:rPr>
-              <w:instrText xml:space="preserve"> PAGEREF _Toc209088594 \h </w:instrText>
+              <w:instrText xml:space="preserve"> PAGEREF _Toc210854124 \h </w:instrText>
             </w:r>
             <w:r>
               <w:rPr>
@@ -500,7 +744,7 @@
                 <w:noProof/>
                 <w:webHidden/>
               </w:rPr>
-              <w:t>5</w:t>
+              <w:t>11</w:t>
             </w:r>
             <w:r>
               <w:rPr>
@@ -524,7 +768,7 @@
               <w:lang w:val="en-RU" w:eastAsia="en-GB"/>
             </w:rPr>
           </w:pPr>
-          <w:hyperlink w:anchor="_Toc209088595" w:history="1">
+          <w:hyperlink w:anchor="_Toc210854125" w:history="1">
             <w:r>
               <w:rPr>
                 <w:rStyle w:val="Hyperlink"/>
@@ -553,7 +797,7 @@
                 <w:noProof/>
                 <w:webHidden/>
               </w:rPr>
-              <w:instrText xml:space="preserve"> PAGEREF _Toc209088595 \h </w:instrText>
+              <w:instrText xml:space="preserve"> PAGEREF _Toc210854125 \h </w:instrText>
             </w:r>
             <w:r>
               <w:rPr>
@@ -573,7 +817,7 @@
                 <w:noProof/>
                 <w:webHidden/>
               </w:rPr>
-              <w:t>6</w:t>
+              <w:t>12</w:t>
             </w:r>
             <w:r>
               <w:rPr>
@@ -625,8 +869,6 @@
       </w:pPr>
     </w:p>
     <w:p/>
-    <w:p/>
-    <w:p/>
     <w:p>
       <w:pPr>
         <w:pStyle w:val="Heading1"/>
@@ -636,7 +878,7 @@
           <w:bCs/>
         </w:rPr>
       </w:pPr>
-      <w:bookmarkStart w:id="0" w:name="_Toc209088592"/>
+      <w:bookmarkStart w:id="0" w:name="_Toc210854119"/>
       <w:r>
         <w:rPr>
           <w:b/>
@@ -948,7 +1190,7 @@
           <w:lang w:val="en-US"/>
         </w:rPr>
       </w:pPr>
-      <w:bookmarkStart w:id="1" w:name="_Toc209088593"/>
+      <w:bookmarkStart w:id="1" w:name="_Toc210854120"/>
       <w:r>
         <w:rPr>
           <w:b/>
@@ -971,9 +1213,11 @@
         <w:pStyle w:val="Heading2"/>
         <w:jc w:val="center"/>
       </w:pPr>
+      <w:bookmarkStart w:id="2" w:name="_Toc210854121"/>
       <w:r>
         <w:t>Исходный код</w:t>
       </w:r>
+      <w:bookmarkEnd w:id="2"/>
     </w:p>
     <w:p>
       <w:pPr>
@@ -1115,7 +1359,6 @@
           <w:bCs/>
         </w:rPr>
       </w:pPr>
-      <w:bookmarkStart w:id="2" w:name="_Toc209088594"/>
     </w:p>
     <w:p>
       <w:pPr>
@@ -1160,6 +1403,7 @@
         <w:pStyle w:val="Heading2"/>
         <w:jc w:val="center"/>
       </w:pPr>
+      <w:bookmarkStart w:id="3" w:name="_Toc210854122"/>
       <w:r>
         <w:rPr>
           <w:lang w:val="en-RU"/>
@@ -1167,13 +1411,2068 @@
         <w:lastRenderedPageBreak/>
         <w:t>Диаграмма классов реализованной объектной модели</w:t>
       </w:r>
-    </w:p>
-    <w:p>
-      <w:pPr>
-        <w:rPr>
-          <w:lang w:val="en-RU"/>
-        </w:rPr>
-      </w:pPr>
+      <w:bookmarkEnd w:id="3"/>
+    </w:p>
+    <w:p>
+      <w:pPr>
+        <w:jc w:val="center"/>
+      </w:pPr>
+      <w:r>
+        <w:rPr>
+          <w:noProof/>
+        </w:rPr>
+        <w:drawing>
+          <wp:inline distT="0" distB="0" distL="0" distR="0" wp14:anchorId="19FAD652" wp14:editId="418B67B7">
+            <wp:extent cx="4834647" cy="4286387"/>
+            <wp:effectExtent l="0" t="0" r="4445" b="0"/>
+            <wp:docPr id="432593079" name="Picture 4" descr="A screenshot of a computer&#10;&#10;AI-generated content may be incorrect."/>
+            <wp:cNvGraphicFramePr>
+              <a:graphicFrameLocks xmlns:a="http://schemas.openxmlformats.org/drawingml/2006/main" noChangeAspect="1"/>
+            </wp:cNvGraphicFramePr>
+            <a:graphic xmlns:a="http://schemas.openxmlformats.org/drawingml/2006/main">
+              <a:graphicData uri="http://schemas.openxmlformats.org/drawingml/2006/picture">
+                <pic:pic xmlns:pic="http://schemas.openxmlformats.org/drawingml/2006/picture">
+                  <pic:nvPicPr>
+                    <pic:cNvPr id="432593079" name="Picture 4" descr="A screenshot of a computer&#10;&#10;AI-generated content may be incorrect."/>
+                    <pic:cNvPicPr/>
+                  </pic:nvPicPr>
+                  <pic:blipFill>
+                    <a:blip r:embed="rId12">
+                      <a:extLst>
+                        <a:ext uri="{28A0092B-C50C-407E-A947-70E740481C1C}">
+                          <a14:useLocalDpi xmlns:a14="http://schemas.microsoft.com/office/drawing/2010/main" val="0"/>
+                        </a:ext>
+                      </a:extLst>
+                    </a:blip>
+                    <a:stretch>
+                      <a:fillRect/>
+                    </a:stretch>
+                  </pic:blipFill>
+                  <pic:spPr>
+                    <a:xfrm>
+                      <a:off x="0" y="0"/>
+                      <a:ext cx="4972996" cy="4409047"/>
+                    </a:xfrm>
+                    <a:prstGeom prst="rect">
+                      <a:avLst/>
+                    </a:prstGeom>
+                  </pic:spPr>
+                </pic:pic>
+              </a:graphicData>
+            </a:graphic>
+          </wp:inline>
+        </w:drawing>
+      </w:r>
+    </w:p>
+    <w:p>
+      <w:pPr>
+        <w:jc w:val="center"/>
+        <w:rPr>
+          <w:i/>
+          <w:iCs/>
+          <w:sz w:val="18"/>
+          <w:szCs w:val="18"/>
+        </w:rPr>
+      </w:pPr>
+      <w:r>
+        <w:rPr>
+          <w:i/>
+          <w:iCs/>
+          <w:sz w:val="18"/>
+          <w:szCs w:val="18"/>
+        </w:rPr>
+        <w:t>Рисунок 4</w:t>
+      </w:r>
+    </w:p>
+    <w:p>
+      <w:pPr>
+        <w:jc w:val="center"/>
+      </w:pPr>
+      <w:r>
+        <w:rPr>
+          <w:noProof/>
+        </w:rPr>
+        <w:drawing>
+          <wp:inline distT="0" distB="0" distL="0" distR="0" wp14:anchorId="17B9E029" wp14:editId="5D204E8D">
+            <wp:extent cx="4622800" cy="3719252"/>
+            <wp:effectExtent l="0" t="0" r="0" b="1905"/>
+            <wp:docPr id="321980718" name="Picture 6" descr="A screenshot of a computer&#10;&#10;AI-generated content may be incorrect."/>
+            <wp:cNvGraphicFramePr>
+              <a:graphicFrameLocks xmlns:a="http://schemas.openxmlformats.org/drawingml/2006/main" noChangeAspect="1"/>
+            </wp:cNvGraphicFramePr>
+            <a:graphic xmlns:a="http://schemas.openxmlformats.org/drawingml/2006/main">
+              <a:graphicData uri="http://schemas.openxmlformats.org/drawingml/2006/picture">
+                <pic:pic xmlns:pic="http://schemas.openxmlformats.org/drawingml/2006/picture">
+                  <pic:nvPicPr>
+                    <pic:cNvPr id="321980718" name="Picture 6" descr="A screenshot of a computer&#10;&#10;AI-generated content may be incorrect."/>
+                    <pic:cNvPicPr/>
+                  </pic:nvPicPr>
+                  <pic:blipFill>
+                    <a:blip r:embed="rId13">
+                      <a:extLst>
+                        <a:ext uri="{28A0092B-C50C-407E-A947-70E740481C1C}">
+                          <a14:useLocalDpi xmlns:a14="http://schemas.microsoft.com/office/drawing/2010/main" val="0"/>
+                        </a:ext>
+                      </a:extLst>
+                    </a:blip>
+                    <a:stretch>
+                      <a:fillRect/>
+                    </a:stretch>
+                  </pic:blipFill>
+                  <pic:spPr>
+                    <a:xfrm>
+                      <a:off x="0" y="0"/>
+                      <a:ext cx="4670223" cy="3757406"/>
+                    </a:xfrm>
+                    <a:prstGeom prst="rect">
+                      <a:avLst/>
+                    </a:prstGeom>
+                  </pic:spPr>
+                </pic:pic>
+              </a:graphicData>
+            </a:graphic>
+          </wp:inline>
+        </w:drawing>
+      </w:r>
+    </w:p>
+    <w:p>
+      <w:pPr>
+        <w:jc w:val="center"/>
+        <w:rPr>
+          <w:i/>
+          <w:iCs/>
+          <w:sz w:val="18"/>
+          <w:szCs w:val="18"/>
+        </w:rPr>
+      </w:pPr>
+      <w:r>
+        <w:rPr>
+          <w:i/>
+          <w:iCs/>
+          <w:sz w:val="18"/>
+          <w:szCs w:val="18"/>
+        </w:rPr>
+        <w:t>Рисунок 5</w:t>
+      </w:r>
+    </w:p>
+    <w:p>
+      <w:pPr>
+        <w:pStyle w:val="Heading2"/>
+        <w:jc w:val="center"/>
+        <w:rPr>
+          <w:lang w:val="en-US"/>
+        </w:rPr>
+      </w:pPr>
+      <w:bookmarkStart w:id="4" w:name="_Toc210854123"/>
+      <w:r>
+        <w:lastRenderedPageBreak/>
+        <w:t>Результат</w:t>
+      </w:r>
+      <w:r>
+        <w:rPr>
+          <w:lang w:val="en-US"/>
+        </w:rPr>
+        <w:t xml:space="preserve"> </w:t>
+      </w:r>
+      <w:r>
+        <w:t>работы</w:t>
+      </w:r>
+      <w:r>
+        <w:rPr>
+          <w:lang w:val="en-US"/>
+        </w:rPr>
+        <w:t xml:space="preserve"> </w:t>
+      </w:r>
+      <w:r>
+        <w:t>программы</w:t>
+      </w:r>
+      <w:bookmarkEnd w:id="4"/>
+    </w:p>
+    <w:p>
+      <w:pPr>
+        <w:rPr>
+          <w:lang w:val="en-GB"/>
+        </w:rPr>
+      </w:pPr>
+      <w:proofErr w:type="spellStart"/>
+      <w:r>
+        <w:rPr>
+          <w:lang w:val="en-GB"/>
+        </w:rPr>
+        <w:t>Landorus</w:t>
+      </w:r>
+      <w:proofErr w:type="spellEnd"/>
+      <w:r>
+        <w:rPr>
+          <w:lang w:val="en-GB"/>
+        </w:rPr>
+        <w:t xml:space="preserve"> First from the team Yellow enters the battle!</w:t>
+      </w:r>
+    </w:p>
+    <w:p>
+      <w:pPr>
+        <w:rPr>
+          <w:lang w:val="en-GB"/>
+        </w:rPr>
+      </w:pPr>
+      <w:proofErr w:type="spellStart"/>
+      <w:r>
+        <w:rPr>
+          <w:lang w:val="en-GB"/>
+        </w:rPr>
+        <w:t>Ralts</w:t>
+      </w:r>
+      <w:proofErr w:type="spellEnd"/>
+      <w:r>
+        <w:rPr>
+          <w:lang w:val="en-GB"/>
+        </w:rPr>
+        <w:t xml:space="preserve"> Fourth from the team Purple enters the battle!</w:t>
+      </w:r>
+    </w:p>
+    <w:p>
+      <w:pPr>
+        <w:rPr>
+          <w:lang w:val="en-GB"/>
+        </w:rPr>
+      </w:pPr>
+      <w:proofErr w:type="spellStart"/>
+      <w:r>
+        <w:rPr>
+          <w:lang w:val="en-GB"/>
+        </w:rPr>
+        <w:t>Landorus</w:t>
+      </w:r>
+      <w:proofErr w:type="spellEnd"/>
+      <w:r>
+        <w:rPr>
+          <w:lang w:val="en-GB"/>
+        </w:rPr>
+        <w:t xml:space="preserve"> First uses </w:t>
+      </w:r>
+      <w:proofErr w:type="spellStart"/>
+      <w:r>
+        <w:rPr>
+          <w:lang w:val="en-GB"/>
+        </w:rPr>
+        <w:t>EarthPower</w:t>
+      </w:r>
+      <w:proofErr w:type="spellEnd"/>
+      <w:r>
+        <w:rPr>
+          <w:lang w:val="en-GB"/>
+        </w:rPr>
+        <w:t xml:space="preserve">. </w:t>
+      </w:r>
+    </w:p>
+    <w:p>
+      <w:pPr>
+        <w:rPr>
+          <w:lang w:val="en-GB"/>
+        </w:rPr>
+      </w:pPr>
+      <w:proofErr w:type="spellStart"/>
+      <w:r>
+        <w:rPr>
+          <w:lang w:val="en-GB"/>
+        </w:rPr>
+        <w:t>Ralts</w:t>
+      </w:r>
+      <w:proofErr w:type="spellEnd"/>
+      <w:r>
+        <w:rPr>
+          <w:lang w:val="en-GB"/>
+        </w:rPr>
+        <w:t xml:space="preserve"> Fourth loses 7 hit points.</w:t>
+      </w:r>
+    </w:p>
+    <w:p>
+      <w:pPr>
+        <w:rPr>
+          <w:lang w:val="en-GB"/>
+        </w:rPr>
+      </w:pPr>
+    </w:p>
+    <w:p>
+      <w:pPr>
+        <w:rPr>
+          <w:lang w:val="en-GB"/>
+        </w:rPr>
+      </w:pPr>
+      <w:proofErr w:type="spellStart"/>
+      <w:r>
+        <w:rPr>
+          <w:lang w:val="en-GB"/>
+        </w:rPr>
+        <w:t>Ralts</w:t>
+      </w:r>
+      <w:proofErr w:type="spellEnd"/>
+      <w:r>
+        <w:rPr>
+          <w:lang w:val="en-GB"/>
+        </w:rPr>
+        <w:t xml:space="preserve"> Fourth uses </w:t>
+      </w:r>
+      <w:proofErr w:type="spellStart"/>
+      <w:r>
+        <w:rPr>
+          <w:lang w:val="en-GB"/>
+        </w:rPr>
+        <w:t>CalmMind</w:t>
+      </w:r>
+      <w:proofErr w:type="spellEnd"/>
+      <w:r>
+        <w:rPr>
+          <w:lang w:val="en-GB"/>
+        </w:rPr>
+        <w:t xml:space="preserve">. </w:t>
+      </w:r>
+    </w:p>
+    <w:p>
+      <w:pPr>
+        <w:rPr>
+          <w:lang w:val="en-GB"/>
+        </w:rPr>
+      </w:pPr>
+      <w:proofErr w:type="spellStart"/>
+      <w:r>
+        <w:rPr>
+          <w:lang w:val="en-GB"/>
+        </w:rPr>
+        <w:t>Ralts</w:t>
+      </w:r>
+      <w:proofErr w:type="spellEnd"/>
+      <w:r>
+        <w:rPr>
+          <w:lang w:val="en-GB"/>
+        </w:rPr>
+        <w:t xml:space="preserve"> Fourth increases special attack.</w:t>
+      </w:r>
+    </w:p>
+    <w:p>
+      <w:pPr>
+        <w:rPr>
+          <w:lang w:val="en-GB"/>
+        </w:rPr>
+      </w:pPr>
+      <w:proofErr w:type="spellStart"/>
+      <w:r>
+        <w:rPr>
+          <w:lang w:val="en-GB"/>
+        </w:rPr>
+        <w:t>Ralts</w:t>
+      </w:r>
+      <w:proofErr w:type="spellEnd"/>
+      <w:r>
+        <w:rPr>
+          <w:lang w:val="en-GB"/>
+        </w:rPr>
+        <w:t xml:space="preserve"> Fourth increases special </w:t>
+      </w:r>
+      <w:proofErr w:type="spellStart"/>
+      <w:r>
+        <w:rPr>
+          <w:lang w:val="en-GB"/>
+        </w:rPr>
+        <w:t>defense</w:t>
+      </w:r>
+      <w:proofErr w:type="spellEnd"/>
+      <w:r>
+        <w:rPr>
+          <w:lang w:val="en-GB"/>
+        </w:rPr>
+        <w:t>.</w:t>
+      </w:r>
+    </w:p>
+    <w:p>
+      <w:pPr>
+        <w:rPr>
+          <w:lang w:val="en-GB"/>
+        </w:rPr>
+      </w:pPr>
+    </w:p>
+    <w:p>
+      <w:pPr>
+        <w:rPr>
+          <w:lang w:val="en-GB"/>
+        </w:rPr>
+      </w:pPr>
+      <w:proofErr w:type="spellStart"/>
+      <w:r>
+        <w:rPr>
+          <w:lang w:val="en-GB"/>
+        </w:rPr>
+        <w:t>Landorus</w:t>
+      </w:r>
+      <w:proofErr w:type="spellEnd"/>
+      <w:r>
+        <w:rPr>
+          <w:lang w:val="en-GB"/>
+        </w:rPr>
+        <w:t xml:space="preserve"> First uses </w:t>
+      </w:r>
+      <w:proofErr w:type="spellStart"/>
+      <w:r>
+        <w:rPr>
+          <w:lang w:val="en-GB"/>
+        </w:rPr>
+        <w:t>RockTomb</w:t>
+      </w:r>
+      <w:proofErr w:type="spellEnd"/>
+      <w:r>
+        <w:rPr>
+          <w:lang w:val="en-GB"/>
+        </w:rPr>
+        <w:t xml:space="preserve">. </w:t>
+      </w:r>
+    </w:p>
+    <w:p>
+      <w:pPr>
+        <w:rPr>
+          <w:lang w:val="en-GB"/>
+        </w:rPr>
+      </w:pPr>
+      <w:proofErr w:type="spellStart"/>
+      <w:r>
+        <w:rPr>
+          <w:lang w:val="en-GB"/>
+        </w:rPr>
+        <w:t>Ralts</w:t>
+      </w:r>
+      <w:proofErr w:type="spellEnd"/>
+      <w:r>
+        <w:rPr>
+          <w:lang w:val="en-GB"/>
+        </w:rPr>
+        <w:t xml:space="preserve"> Fourth loses 6 hit points.</w:t>
+      </w:r>
+    </w:p>
+    <w:p>
+      <w:pPr>
+        <w:rPr>
+          <w:lang w:val="en-GB"/>
+        </w:rPr>
+      </w:pPr>
+      <w:proofErr w:type="spellStart"/>
+      <w:r>
+        <w:rPr>
+          <w:lang w:val="en-GB"/>
+        </w:rPr>
+        <w:t>Ralts</w:t>
+      </w:r>
+      <w:proofErr w:type="spellEnd"/>
+      <w:r>
+        <w:rPr>
+          <w:lang w:val="en-GB"/>
+        </w:rPr>
+        <w:t xml:space="preserve"> Fourth decreases speed.</w:t>
+      </w:r>
+    </w:p>
+    <w:p>
+      <w:pPr>
+        <w:rPr>
+          <w:lang w:val="en-GB"/>
+        </w:rPr>
+      </w:pPr>
+      <w:proofErr w:type="spellStart"/>
+      <w:r>
+        <w:rPr>
+          <w:lang w:val="en-GB"/>
+        </w:rPr>
+        <w:t>Ralts</w:t>
+      </w:r>
+      <w:proofErr w:type="spellEnd"/>
+      <w:r>
+        <w:rPr>
+          <w:lang w:val="en-GB"/>
+        </w:rPr>
+        <w:t xml:space="preserve"> Fourth faints.</w:t>
+      </w:r>
+    </w:p>
+    <w:p>
+      <w:pPr>
+        <w:rPr>
+          <w:lang w:val="en-GB"/>
+        </w:rPr>
+      </w:pPr>
+      <w:proofErr w:type="spellStart"/>
+      <w:r>
+        <w:rPr>
+          <w:lang w:val="en-GB"/>
+        </w:rPr>
+        <w:t>Kirlia</w:t>
+      </w:r>
+      <w:proofErr w:type="spellEnd"/>
+      <w:r>
+        <w:rPr>
+          <w:lang w:val="en-GB"/>
+        </w:rPr>
+        <w:t xml:space="preserve"> Fifth from the team Purple enters the battle!</w:t>
+      </w:r>
+    </w:p>
+    <w:p>
+      <w:pPr>
+        <w:rPr>
+          <w:lang w:val="en-GB"/>
+        </w:rPr>
+      </w:pPr>
+      <w:proofErr w:type="spellStart"/>
+      <w:r>
+        <w:rPr>
+          <w:lang w:val="en-GB"/>
+        </w:rPr>
+        <w:t>Landorus</w:t>
+      </w:r>
+      <w:proofErr w:type="spellEnd"/>
+      <w:r>
+        <w:rPr>
+          <w:lang w:val="en-GB"/>
+        </w:rPr>
+        <w:t xml:space="preserve"> First uses </w:t>
+      </w:r>
+      <w:proofErr w:type="spellStart"/>
+      <w:r>
+        <w:rPr>
+          <w:lang w:val="en-GB"/>
+        </w:rPr>
+        <w:t>RockTomb</w:t>
+      </w:r>
+      <w:proofErr w:type="spellEnd"/>
+      <w:r>
+        <w:rPr>
+          <w:lang w:val="en-GB"/>
+        </w:rPr>
+        <w:t xml:space="preserve">. </w:t>
+      </w:r>
+    </w:p>
+    <w:p>
+      <w:pPr>
+        <w:rPr>
+          <w:lang w:val="en-GB"/>
+        </w:rPr>
+      </w:pPr>
+      <w:proofErr w:type="spellStart"/>
+      <w:r>
+        <w:rPr>
+          <w:lang w:val="en-GB"/>
+        </w:rPr>
+        <w:t>Kirlia</w:t>
+      </w:r>
+      <w:proofErr w:type="spellEnd"/>
+      <w:r>
+        <w:rPr>
+          <w:lang w:val="en-GB"/>
+        </w:rPr>
+        <w:t xml:space="preserve"> Fifth loses 3 hit points.</w:t>
+      </w:r>
+    </w:p>
+    <w:p>
+      <w:pPr>
+        <w:rPr>
+          <w:lang w:val="en-GB"/>
+        </w:rPr>
+      </w:pPr>
+      <w:proofErr w:type="spellStart"/>
+      <w:r>
+        <w:rPr>
+          <w:lang w:val="en-GB"/>
+        </w:rPr>
+        <w:t>Kirlia</w:t>
+      </w:r>
+      <w:proofErr w:type="spellEnd"/>
+      <w:r>
+        <w:rPr>
+          <w:lang w:val="en-GB"/>
+        </w:rPr>
+        <w:t xml:space="preserve"> Fifth decreases speed.</w:t>
+      </w:r>
+    </w:p>
+    <w:p>
+      <w:pPr>
+        <w:rPr>
+          <w:lang w:val="en-GB"/>
+        </w:rPr>
+      </w:pPr>
+    </w:p>
+    <w:p>
+      <w:pPr>
+        <w:rPr>
+          <w:lang w:val="en-GB"/>
+        </w:rPr>
+      </w:pPr>
+      <w:proofErr w:type="spellStart"/>
+      <w:r>
+        <w:rPr>
+          <w:lang w:val="en-GB"/>
+        </w:rPr>
+        <w:t>Kirlia</w:t>
+      </w:r>
+      <w:proofErr w:type="spellEnd"/>
+      <w:r>
+        <w:rPr>
+          <w:lang w:val="en-GB"/>
+        </w:rPr>
+        <w:t xml:space="preserve"> Fifth uses </w:t>
+      </w:r>
+      <w:proofErr w:type="spellStart"/>
+      <w:r>
+        <w:rPr>
+          <w:lang w:val="en-GB"/>
+        </w:rPr>
+        <w:t>CalmMind</w:t>
+      </w:r>
+      <w:proofErr w:type="spellEnd"/>
+      <w:r>
+        <w:rPr>
+          <w:lang w:val="en-GB"/>
+        </w:rPr>
+        <w:t xml:space="preserve">. </w:t>
+      </w:r>
+    </w:p>
+    <w:p>
+      <w:pPr>
+        <w:rPr>
+          <w:lang w:val="en-GB"/>
+        </w:rPr>
+      </w:pPr>
+      <w:proofErr w:type="spellStart"/>
+      <w:r>
+        <w:rPr>
+          <w:lang w:val="en-GB"/>
+        </w:rPr>
+        <w:t>Kirlia</w:t>
+      </w:r>
+      <w:proofErr w:type="spellEnd"/>
+      <w:r>
+        <w:rPr>
+          <w:lang w:val="en-GB"/>
+        </w:rPr>
+        <w:t xml:space="preserve"> Fifth increases special attack.</w:t>
+      </w:r>
+    </w:p>
+    <w:p>
+      <w:pPr>
+        <w:rPr>
+          <w:lang w:val="en-GB"/>
+        </w:rPr>
+      </w:pPr>
+      <w:proofErr w:type="spellStart"/>
+      <w:r>
+        <w:rPr>
+          <w:lang w:val="en-GB"/>
+        </w:rPr>
+        <w:t>Kirlia</w:t>
+      </w:r>
+      <w:proofErr w:type="spellEnd"/>
+      <w:r>
+        <w:rPr>
+          <w:lang w:val="en-GB"/>
+        </w:rPr>
+        <w:t xml:space="preserve"> Fifth increases special </w:t>
+      </w:r>
+      <w:proofErr w:type="spellStart"/>
+      <w:r>
+        <w:rPr>
+          <w:lang w:val="en-GB"/>
+        </w:rPr>
+        <w:t>defense</w:t>
+      </w:r>
+      <w:proofErr w:type="spellEnd"/>
+      <w:r>
+        <w:rPr>
+          <w:lang w:val="en-GB"/>
+        </w:rPr>
+        <w:t>.</w:t>
+      </w:r>
+    </w:p>
+    <w:p>
+      <w:pPr>
+        <w:rPr>
+          <w:lang w:val="en-GB"/>
+        </w:rPr>
+      </w:pPr>
+    </w:p>
+    <w:p>
+      <w:pPr>
+        <w:rPr>
+          <w:lang w:val="en-GB"/>
+        </w:rPr>
+      </w:pPr>
+      <w:proofErr w:type="spellStart"/>
+      <w:r>
+        <w:rPr>
+          <w:lang w:val="en-GB"/>
+        </w:rPr>
+        <w:lastRenderedPageBreak/>
+        <w:t>Landorus</w:t>
+      </w:r>
+      <w:proofErr w:type="spellEnd"/>
+      <w:r>
+        <w:rPr>
+          <w:lang w:val="en-GB"/>
+        </w:rPr>
+        <w:t xml:space="preserve"> First uses Rest. </w:t>
+      </w:r>
+    </w:p>
+    <w:p>
+      <w:pPr>
+        <w:rPr>
+          <w:lang w:val="en-GB"/>
+        </w:rPr>
+      </w:pPr>
+      <w:r>
+        <w:rPr>
+          <w:lang w:val="en-GB"/>
+        </w:rPr>
+        <w:t>Health restored</w:t>
+      </w:r>
+    </w:p>
+    <w:p>
+      <w:pPr>
+        <w:rPr>
+          <w:lang w:val="en-GB"/>
+        </w:rPr>
+      </w:pPr>
+      <w:proofErr w:type="spellStart"/>
+      <w:r>
+        <w:rPr>
+          <w:lang w:val="en-GB"/>
+        </w:rPr>
+        <w:t>Landorus</w:t>
+      </w:r>
+      <w:proofErr w:type="spellEnd"/>
+      <w:r>
+        <w:rPr>
+          <w:lang w:val="en-GB"/>
+        </w:rPr>
+        <w:t xml:space="preserve"> First is sleeping</w:t>
+      </w:r>
+    </w:p>
+    <w:p>
+      <w:pPr>
+        <w:rPr>
+          <w:lang w:val="en-GB"/>
+        </w:rPr>
+      </w:pPr>
+    </w:p>
+    <w:p>
+      <w:pPr>
+        <w:rPr>
+          <w:lang w:val="en-GB"/>
+        </w:rPr>
+      </w:pPr>
+      <w:proofErr w:type="spellStart"/>
+      <w:r>
+        <w:rPr>
+          <w:lang w:val="en-GB"/>
+        </w:rPr>
+        <w:t>Kirlia</w:t>
+      </w:r>
+      <w:proofErr w:type="spellEnd"/>
+      <w:r>
+        <w:rPr>
+          <w:lang w:val="en-GB"/>
+        </w:rPr>
+        <w:t xml:space="preserve"> Fifth uses </w:t>
+      </w:r>
+      <w:proofErr w:type="spellStart"/>
+      <w:r>
+        <w:rPr>
+          <w:lang w:val="en-GB"/>
+        </w:rPr>
+        <w:t>CalmMind</w:t>
+      </w:r>
+      <w:proofErr w:type="spellEnd"/>
+      <w:r>
+        <w:rPr>
+          <w:lang w:val="en-GB"/>
+        </w:rPr>
+        <w:t xml:space="preserve">. </w:t>
+      </w:r>
+    </w:p>
+    <w:p>
+      <w:pPr>
+        <w:rPr>
+          <w:lang w:val="en-GB"/>
+        </w:rPr>
+      </w:pPr>
+      <w:proofErr w:type="spellStart"/>
+      <w:r>
+        <w:rPr>
+          <w:lang w:val="en-GB"/>
+        </w:rPr>
+        <w:t>Kirlia</w:t>
+      </w:r>
+      <w:proofErr w:type="spellEnd"/>
+      <w:r>
+        <w:rPr>
+          <w:lang w:val="en-GB"/>
+        </w:rPr>
+        <w:t xml:space="preserve"> Fifth increases special attack.</w:t>
+      </w:r>
+    </w:p>
+    <w:p>
+      <w:pPr>
+        <w:rPr>
+          <w:lang w:val="en-GB"/>
+        </w:rPr>
+      </w:pPr>
+      <w:proofErr w:type="spellStart"/>
+      <w:r>
+        <w:rPr>
+          <w:lang w:val="en-GB"/>
+        </w:rPr>
+        <w:t>Kirlia</w:t>
+      </w:r>
+      <w:proofErr w:type="spellEnd"/>
+      <w:r>
+        <w:rPr>
+          <w:lang w:val="en-GB"/>
+        </w:rPr>
+        <w:t xml:space="preserve"> Fifth increases special </w:t>
+      </w:r>
+      <w:proofErr w:type="spellStart"/>
+      <w:r>
+        <w:rPr>
+          <w:lang w:val="en-GB"/>
+        </w:rPr>
+        <w:t>defense</w:t>
+      </w:r>
+      <w:proofErr w:type="spellEnd"/>
+      <w:r>
+        <w:rPr>
+          <w:lang w:val="en-GB"/>
+        </w:rPr>
+        <w:t>.</w:t>
+      </w:r>
+    </w:p>
+    <w:p>
+      <w:pPr>
+        <w:rPr>
+          <w:lang w:val="en-GB"/>
+        </w:rPr>
+      </w:pPr>
+    </w:p>
+    <w:p>
+      <w:pPr>
+        <w:rPr>
+          <w:lang w:val="en-GB"/>
+        </w:rPr>
+      </w:pPr>
+      <w:proofErr w:type="spellStart"/>
+      <w:r>
+        <w:rPr>
+          <w:lang w:val="en-GB"/>
+        </w:rPr>
+        <w:t>Kirlia</w:t>
+      </w:r>
+      <w:proofErr w:type="spellEnd"/>
+      <w:r>
+        <w:rPr>
+          <w:lang w:val="en-GB"/>
+        </w:rPr>
+        <w:t xml:space="preserve"> Fifth uses </w:t>
+      </w:r>
+      <w:proofErr w:type="spellStart"/>
+      <w:r>
+        <w:rPr>
+          <w:lang w:val="en-GB"/>
+        </w:rPr>
+        <w:t>DrainingKiss</w:t>
+      </w:r>
+      <w:proofErr w:type="spellEnd"/>
+      <w:r>
+        <w:rPr>
+          <w:lang w:val="en-GB"/>
+        </w:rPr>
+        <w:t xml:space="preserve">. </w:t>
+      </w:r>
+    </w:p>
+    <w:p>
+      <w:pPr>
+        <w:rPr>
+          <w:lang w:val="en-GB"/>
+        </w:rPr>
+      </w:pPr>
+      <w:proofErr w:type="spellStart"/>
+      <w:r>
+        <w:rPr>
+          <w:lang w:val="en-GB"/>
+        </w:rPr>
+        <w:t>Landorus</w:t>
+      </w:r>
+      <w:proofErr w:type="spellEnd"/>
+      <w:r>
+        <w:rPr>
+          <w:lang w:val="en-GB"/>
+        </w:rPr>
+        <w:t xml:space="preserve"> First loses 8 hit points.</w:t>
+      </w:r>
+    </w:p>
+    <w:p>
+      <w:pPr>
+        <w:rPr>
+          <w:lang w:val="en-GB"/>
+        </w:rPr>
+      </w:pPr>
+      <w:proofErr w:type="spellStart"/>
+      <w:r>
+        <w:rPr>
+          <w:lang w:val="en-GB"/>
+        </w:rPr>
+        <w:t>Kirlia</w:t>
+      </w:r>
+      <w:proofErr w:type="spellEnd"/>
+      <w:r>
+        <w:rPr>
+          <w:lang w:val="en-GB"/>
+        </w:rPr>
+        <w:t xml:space="preserve"> Fifth restores 6 hit points.</w:t>
+      </w:r>
+    </w:p>
+    <w:p>
+      <w:pPr>
+        <w:rPr>
+          <w:lang w:val="en-GB"/>
+        </w:rPr>
+      </w:pPr>
+    </w:p>
+    <w:p>
+      <w:pPr>
+        <w:rPr>
+          <w:lang w:val="en-GB"/>
+        </w:rPr>
+      </w:pPr>
+    </w:p>
+    <w:p>
+      <w:pPr>
+        <w:rPr>
+          <w:lang w:val="en-GB"/>
+        </w:rPr>
+      </w:pPr>
+      <w:proofErr w:type="spellStart"/>
+      <w:r>
+        <w:rPr>
+          <w:lang w:val="en-GB"/>
+        </w:rPr>
+        <w:t>Landorus</w:t>
+      </w:r>
+      <w:proofErr w:type="spellEnd"/>
+      <w:r>
+        <w:rPr>
+          <w:lang w:val="en-GB"/>
+        </w:rPr>
+        <w:t xml:space="preserve"> First uses </w:t>
+      </w:r>
+      <w:proofErr w:type="spellStart"/>
+      <w:r>
+        <w:rPr>
+          <w:lang w:val="en-GB"/>
+        </w:rPr>
+        <w:t>EarthPower</w:t>
+      </w:r>
+      <w:proofErr w:type="spellEnd"/>
+      <w:r>
+        <w:rPr>
+          <w:lang w:val="en-GB"/>
+        </w:rPr>
+        <w:t xml:space="preserve">. </w:t>
+      </w:r>
+    </w:p>
+    <w:p>
+      <w:pPr>
+        <w:rPr>
+          <w:lang w:val="en-GB"/>
+        </w:rPr>
+      </w:pPr>
+      <w:proofErr w:type="spellStart"/>
+      <w:r>
+        <w:rPr>
+          <w:lang w:val="en-GB"/>
+        </w:rPr>
+        <w:t>Kirlia</w:t>
+      </w:r>
+      <w:proofErr w:type="spellEnd"/>
+      <w:r>
+        <w:rPr>
+          <w:lang w:val="en-GB"/>
+        </w:rPr>
+        <w:t xml:space="preserve"> Fifth loses 10 hit points.</w:t>
+      </w:r>
+    </w:p>
+    <w:p>
+      <w:pPr>
+        <w:rPr>
+          <w:lang w:val="en-GB"/>
+        </w:rPr>
+      </w:pPr>
+    </w:p>
+    <w:p>
+      <w:pPr>
+        <w:rPr>
+          <w:lang w:val="en-GB"/>
+        </w:rPr>
+      </w:pPr>
+      <w:proofErr w:type="spellStart"/>
+      <w:r>
+        <w:rPr>
+          <w:lang w:val="en-GB"/>
+        </w:rPr>
+        <w:t>Kirlia</w:t>
+      </w:r>
+      <w:proofErr w:type="spellEnd"/>
+      <w:r>
+        <w:rPr>
+          <w:lang w:val="en-GB"/>
+        </w:rPr>
+        <w:t xml:space="preserve"> Fifth uses Rest. </w:t>
+      </w:r>
+    </w:p>
+    <w:p>
+      <w:pPr>
+        <w:rPr>
+          <w:lang w:val="en-GB"/>
+        </w:rPr>
+      </w:pPr>
+      <w:r>
+        <w:rPr>
+          <w:lang w:val="en-GB"/>
+        </w:rPr>
+        <w:t>Health restored</w:t>
+      </w:r>
+    </w:p>
+    <w:p>
+      <w:pPr>
+        <w:rPr>
+          <w:lang w:val="en-GB"/>
+        </w:rPr>
+      </w:pPr>
+      <w:proofErr w:type="spellStart"/>
+      <w:r>
+        <w:rPr>
+          <w:lang w:val="en-GB"/>
+        </w:rPr>
+        <w:t>Kirlia</w:t>
+      </w:r>
+      <w:proofErr w:type="spellEnd"/>
+      <w:r>
+        <w:rPr>
+          <w:lang w:val="en-GB"/>
+        </w:rPr>
+        <w:t xml:space="preserve"> Fifth is sleeping</w:t>
+      </w:r>
+    </w:p>
+    <w:p>
+      <w:pPr>
+        <w:rPr>
+          <w:lang w:val="en-GB"/>
+        </w:rPr>
+      </w:pPr>
+    </w:p>
+    <w:p>
+      <w:pPr>
+        <w:rPr>
+          <w:lang w:val="en-GB"/>
+        </w:rPr>
+      </w:pPr>
+      <w:proofErr w:type="spellStart"/>
+      <w:r>
+        <w:rPr>
+          <w:lang w:val="en-GB"/>
+        </w:rPr>
+        <w:t>Landorus</w:t>
+      </w:r>
+      <w:proofErr w:type="spellEnd"/>
+      <w:r>
+        <w:rPr>
+          <w:lang w:val="en-GB"/>
+        </w:rPr>
+        <w:t xml:space="preserve"> First uses </w:t>
+      </w:r>
+      <w:proofErr w:type="spellStart"/>
+      <w:r>
+        <w:rPr>
+          <w:lang w:val="en-GB"/>
+        </w:rPr>
+        <w:t>EarthPower</w:t>
+      </w:r>
+      <w:proofErr w:type="spellEnd"/>
+      <w:r>
+        <w:rPr>
+          <w:lang w:val="en-GB"/>
+        </w:rPr>
+        <w:t xml:space="preserve">. </w:t>
+      </w:r>
+    </w:p>
+    <w:p>
+      <w:pPr>
+        <w:rPr>
+          <w:lang w:val="en-GB"/>
+        </w:rPr>
+      </w:pPr>
+      <w:proofErr w:type="spellStart"/>
+      <w:r>
+        <w:rPr>
+          <w:lang w:val="en-GB"/>
+        </w:rPr>
+        <w:t>Kirlia</w:t>
+      </w:r>
+      <w:proofErr w:type="spellEnd"/>
+      <w:r>
+        <w:rPr>
+          <w:lang w:val="en-GB"/>
+        </w:rPr>
+        <w:t xml:space="preserve"> Fifth loses 8 hit points.</w:t>
+      </w:r>
+    </w:p>
+    <w:p>
+      <w:pPr>
+        <w:rPr>
+          <w:lang w:val="en-GB"/>
+        </w:rPr>
+      </w:pPr>
+    </w:p>
+    <w:p>
+      <w:pPr>
+        <w:rPr>
+          <w:lang w:val="en-GB"/>
+        </w:rPr>
+      </w:pPr>
+    </w:p>
+    <w:p>
+      <w:pPr>
+        <w:rPr>
+          <w:lang w:val="en-GB"/>
+        </w:rPr>
+      </w:pPr>
+      <w:proofErr w:type="spellStart"/>
+      <w:r>
+        <w:rPr>
+          <w:lang w:val="en-GB"/>
+        </w:rPr>
+        <w:t>Landorus</w:t>
+      </w:r>
+      <w:proofErr w:type="spellEnd"/>
+      <w:r>
+        <w:rPr>
+          <w:lang w:val="en-GB"/>
+        </w:rPr>
+        <w:t xml:space="preserve"> First uses </w:t>
+      </w:r>
+      <w:proofErr w:type="spellStart"/>
+      <w:r>
+        <w:rPr>
+          <w:lang w:val="en-GB"/>
+        </w:rPr>
+        <w:t>BrutalSwing</w:t>
+      </w:r>
+      <w:proofErr w:type="spellEnd"/>
+      <w:r>
+        <w:rPr>
+          <w:lang w:val="en-GB"/>
+        </w:rPr>
+        <w:t xml:space="preserve">. </w:t>
+      </w:r>
+    </w:p>
+    <w:p>
+      <w:pPr>
+        <w:rPr>
+          <w:lang w:val="en-GB"/>
+        </w:rPr>
+      </w:pPr>
+      <w:proofErr w:type="spellStart"/>
+      <w:r>
+        <w:rPr>
+          <w:lang w:val="en-GB"/>
+        </w:rPr>
+        <w:t>Kirlia</w:t>
+      </w:r>
+      <w:proofErr w:type="spellEnd"/>
+      <w:r>
+        <w:rPr>
+          <w:lang w:val="en-GB"/>
+        </w:rPr>
+        <w:t xml:space="preserve"> Fifth loses 4 hit points.</w:t>
+      </w:r>
+    </w:p>
+    <w:p>
+      <w:pPr>
+        <w:rPr>
+          <w:lang w:val="en-GB"/>
+        </w:rPr>
+      </w:pPr>
+      <w:proofErr w:type="spellStart"/>
+      <w:r>
+        <w:rPr>
+          <w:lang w:val="en-GB"/>
+        </w:rPr>
+        <w:t>Kirlia</w:t>
+      </w:r>
+      <w:proofErr w:type="spellEnd"/>
+      <w:r>
+        <w:rPr>
+          <w:lang w:val="en-GB"/>
+        </w:rPr>
+        <w:t xml:space="preserve"> Fifth faints.</w:t>
+      </w:r>
+    </w:p>
+    <w:p>
+      <w:pPr>
+        <w:rPr>
+          <w:lang w:val="en-GB"/>
+        </w:rPr>
+      </w:pPr>
+      <w:proofErr w:type="spellStart"/>
+      <w:r>
+        <w:rPr>
+          <w:lang w:val="en-GB"/>
+        </w:rPr>
+        <w:t>Gallade</w:t>
+      </w:r>
+      <w:proofErr w:type="spellEnd"/>
+      <w:r>
+        <w:rPr>
+          <w:lang w:val="en-GB"/>
+        </w:rPr>
+        <w:t xml:space="preserve"> Sixth from the team Purple enters the battle!</w:t>
+      </w:r>
+    </w:p>
+    <w:p>
+      <w:pPr>
+        <w:rPr>
+          <w:lang w:val="en-GB"/>
+        </w:rPr>
+      </w:pPr>
+      <w:proofErr w:type="spellStart"/>
+      <w:r>
+        <w:rPr>
+          <w:lang w:val="en-GB"/>
+        </w:rPr>
+        <w:t>Landorus</w:t>
+      </w:r>
+      <w:proofErr w:type="spellEnd"/>
+      <w:r>
+        <w:rPr>
+          <w:lang w:val="en-GB"/>
+        </w:rPr>
+        <w:t xml:space="preserve"> First uses </w:t>
+      </w:r>
+      <w:proofErr w:type="spellStart"/>
+      <w:r>
+        <w:rPr>
+          <w:lang w:val="en-GB"/>
+        </w:rPr>
+        <w:t>BrutalSwing</w:t>
+      </w:r>
+      <w:proofErr w:type="spellEnd"/>
+      <w:r>
+        <w:rPr>
+          <w:lang w:val="en-GB"/>
+        </w:rPr>
+        <w:t xml:space="preserve">. </w:t>
+      </w:r>
+    </w:p>
+    <w:p>
+      <w:pPr>
+        <w:rPr>
+          <w:lang w:val="en-GB"/>
+        </w:rPr>
+      </w:pPr>
+      <w:proofErr w:type="spellStart"/>
+      <w:r>
+        <w:rPr>
+          <w:lang w:val="en-GB"/>
+        </w:rPr>
+        <w:t>Gallade</w:t>
+      </w:r>
+      <w:proofErr w:type="spellEnd"/>
+      <w:r>
+        <w:rPr>
+          <w:lang w:val="en-GB"/>
+        </w:rPr>
+        <w:t xml:space="preserve"> Sixth loses 5 hit points.</w:t>
+      </w:r>
+    </w:p>
+    <w:p>
+      <w:pPr>
+        <w:rPr>
+          <w:lang w:val="en-GB"/>
+        </w:rPr>
+      </w:pPr>
+    </w:p>
+    <w:p>
+      <w:pPr>
+        <w:rPr>
+          <w:lang w:val="en-GB"/>
+        </w:rPr>
+      </w:pPr>
+      <w:proofErr w:type="spellStart"/>
+      <w:r>
+        <w:rPr>
+          <w:lang w:val="en-GB"/>
+        </w:rPr>
+        <w:t>Gallade</w:t>
+      </w:r>
+      <w:proofErr w:type="spellEnd"/>
+      <w:r>
+        <w:rPr>
+          <w:lang w:val="en-GB"/>
+        </w:rPr>
+        <w:t xml:space="preserve"> Sixth uses Confide. </w:t>
+      </w:r>
+    </w:p>
+    <w:p>
+      <w:pPr>
+        <w:rPr>
+          <w:lang w:val="en-GB"/>
+        </w:rPr>
+      </w:pPr>
+      <w:proofErr w:type="spellStart"/>
+      <w:r>
+        <w:rPr>
+          <w:lang w:val="en-GB"/>
+        </w:rPr>
+        <w:t>Landorus</w:t>
+      </w:r>
+      <w:proofErr w:type="spellEnd"/>
+      <w:r>
+        <w:rPr>
+          <w:lang w:val="en-GB"/>
+        </w:rPr>
+        <w:t xml:space="preserve"> First decreases special attack.</w:t>
+      </w:r>
+    </w:p>
+    <w:p>
+      <w:pPr>
+        <w:rPr>
+          <w:lang w:val="en-GB"/>
+        </w:rPr>
+      </w:pPr>
+    </w:p>
+    <w:p>
+      <w:pPr>
+        <w:rPr>
+          <w:lang w:val="en-GB"/>
+        </w:rPr>
+      </w:pPr>
+      <w:proofErr w:type="spellStart"/>
+      <w:r>
+        <w:rPr>
+          <w:lang w:val="en-GB"/>
+        </w:rPr>
+        <w:t>Landorus</w:t>
+      </w:r>
+      <w:proofErr w:type="spellEnd"/>
+      <w:r>
+        <w:rPr>
+          <w:lang w:val="en-GB"/>
+        </w:rPr>
+        <w:t xml:space="preserve"> First uses </w:t>
+      </w:r>
+      <w:proofErr w:type="spellStart"/>
+      <w:r>
+        <w:rPr>
+          <w:lang w:val="en-GB"/>
+        </w:rPr>
+        <w:t>RockTomb</w:t>
+      </w:r>
+      <w:proofErr w:type="spellEnd"/>
+      <w:r>
+        <w:rPr>
+          <w:lang w:val="en-GB"/>
+        </w:rPr>
+        <w:t xml:space="preserve">. </w:t>
+      </w:r>
+    </w:p>
+    <w:p>
+      <w:pPr>
+        <w:rPr>
+          <w:lang w:val="en-GB"/>
+        </w:rPr>
+      </w:pPr>
+      <w:proofErr w:type="spellStart"/>
+      <w:r>
+        <w:rPr>
+          <w:lang w:val="en-GB"/>
+        </w:rPr>
+        <w:t>Gallade</w:t>
+      </w:r>
+      <w:proofErr w:type="spellEnd"/>
+      <w:r>
+        <w:rPr>
+          <w:lang w:val="en-GB"/>
+        </w:rPr>
+        <w:t xml:space="preserve"> Sixth loses 2 hit points.</w:t>
+      </w:r>
+    </w:p>
+    <w:p>
+      <w:pPr>
+        <w:rPr>
+          <w:lang w:val="en-GB"/>
+        </w:rPr>
+      </w:pPr>
+      <w:proofErr w:type="spellStart"/>
+      <w:r>
+        <w:rPr>
+          <w:lang w:val="en-GB"/>
+        </w:rPr>
+        <w:t>Gallade</w:t>
+      </w:r>
+      <w:proofErr w:type="spellEnd"/>
+      <w:r>
+        <w:rPr>
+          <w:lang w:val="en-GB"/>
+        </w:rPr>
+        <w:t xml:space="preserve"> Sixth decreases speed.</w:t>
+      </w:r>
+    </w:p>
+    <w:p>
+      <w:pPr>
+        <w:rPr>
+          <w:lang w:val="en-GB"/>
+        </w:rPr>
+      </w:pPr>
+    </w:p>
+    <w:p>
+      <w:pPr>
+        <w:rPr>
+          <w:lang w:val="en-GB"/>
+        </w:rPr>
+      </w:pPr>
+      <w:proofErr w:type="spellStart"/>
+      <w:r>
+        <w:rPr>
+          <w:lang w:val="en-GB"/>
+        </w:rPr>
+        <w:t>Gallade</w:t>
+      </w:r>
+      <w:proofErr w:type="spellEnd"/>
+      <w:r>
+        <w:rPr>
+          <w:lang w:val="en-GB"/>
+        </w:rPr>
+        <w:t xml:space="preserve"> Sixth uses Confide. </w:t>
+      </w:r>
+    </w:p>
+    <w:p>
+      <w:pPr>
+        <w:rPr>
+          <w:lang w:val="en-GB"/>
+        </w:rPr>
+      </w:pPr>
+      <w:proofErr w:type="spellStart"/>
+      <w:r>
+        <w:rPr>
+          <w:lang w:val="en-GB"/>
+        </w:rPr>
+        <w:t>Landorus</w:t>
+      </w:r>
+      <w:proofErr w:type="spellEnd"/>
+      <w:r>
+        <w:rPr>
+          <w:lang w:val="en-GB"/>
+        </w:rPr>
+        <w:t xml:space="preserve"> First decreases special attack.</w:t>
+      </w:r>
+    </w:p>
+    <w:p>
+      <w:pPr>
+        <w:rPr>
+          <w:lang w:val="en-GB"/>
+        </w:rPr>
+      </w:pPr>
+    </w:p>
+    <w:p>
+      <w:pPr>
+        <w:rPr>
+          <w:lang w:val="en-GB"/>
+        </w:rPr>
+      </w:pPr>
+      <w:proofErr w:type="spellStart"/>
+      <w:r>
+        <w:rPr>
+          <w:lang w:val="en-GB"/>
+        </w:rPr>
+        <w:t>Gallade</w:t>
+      </w:r>
+      <w:proofErr w:type="spellEnd"/>
+      <w:r>
+        <w:rPr>
+          <w:lang w:val="en-GB"/>
+        </w:rPr>
+        <w:t xml:space="preserve"> Sixth uses </w:t>
+      </w:r>
+      <w:proofErr w:type="spellStart"/>
+      <w:r>
+        <w:rPr>
+          <w:lang w:val="en-GB"/>
+        </w:rPr>
+        <w:t>DrainingKiss</w:t>
+      </w:r>
+      <w:proofErr w:type="spellEnd"/>
+      <w:r>
+        <w:rPr>
+          <w:lang w:val="en-GB"/>
+        </w:rPr>
+        <w:t xml:space="preserve">. </w:t>
+      </w:r>
+    </w:p>
+    <w:p>
+      <w:pPr>
+        <w:rPr>
+          <w:lang w:val="en-GB"/>
+        </w:rPr>
+      </w:pPr>
+      <w:proofErr w:type="spellStart"/>
+      <w:r>
+        <w:rPr>
+          <w:lang w:val="en-GB"/>
+        </w:rPr>
+        <w:t>Landorus</w:t>
+      </w:r>
+      <w:proofErr w:type="spellEnd"/>
+      <w:r>
+        <w:rPr>
+          <w:lang w:val="en-GB"/>
+        </w:rPr>
+        <w:t xml:space="preserve"> First loses 5 hit points.</w:t>
+      </w:r>
+    </w:p>
+    <w:p>
+      <w:pPr>
+        <w:rPr>
+          <w:lang w:val="en-GB"/>
+        </w:rPr>
+      </w:pPr>
+      <w:proofErr w:type="spellStart"/>
+      <w:r>
+        <w:rPr>
+          <w:lang w:val="en-GB"/>
+        </w:rPr>
+        <w:t>Gallade</w:t>
+      </w:r>
+      <w:proofErr w:type="spellEnd"/>
+      <w:r>
+        <w:rPr>
+          <w:lang w:val="en-GB"/>
+        </w:rPr>
+        <w:t xml:space="preserve"> Sixth restores 4 hit points.</w:t>
+      </w:r>
+    </w:p>
+    <w:p>
+      <w:pPr>
+        <w:rPr>
+          <w:lang w:val="en-GB"/>
+        </w:rPr>
+      </w:pPr>
+      <w:proofErr w:type="spellStart"/>
+      <w:r>
+        <w:rPr>
+          <w:lang w:val="en-GB"/>
+        </w:rPr>
+        <w:t>Landorus</w:t>
+      </w:r>
+      <w:proofErr w:type="spellEnd"/>
+      <w:r>
+        <w:rPr>
+          <w:lang w:val="en-GB"/>
+        </w:rPr>
+        <w:t xml:space="preserve"> First faints.</w:t>
+      </w:r>
+    </w:p>
+    <w:p>
+      <w:pPr>
+        <w:rPr>
+          <w:lang w:val="en-GB"/>
+        </w:rPr>
+      </w:pPr>
+      <w:proofErr w:type="spellStart"/>
+      <w:r>
+        <w:rPr>
+          <w:lang w:val="en-GB"/>
+        </w:rPr>
+        <w:t>Bergmite</w:t>
+      </w:r>
+      <w:proofErr w:type="spellEnd"/>
+      <w:r>
+        <w:rPr>
+          <w:lang w:val="en-GB"/>
+        </w:rPr>
+        <w:t xml:space="preserve"> Second from the team Yellow enters the battle!</w:t>
+      </w:r>
+    </w:p>
+    <w:p>
+      <w:pPr>
+        <w:rPr>
+          <w:lang w:val="en-GB"/>
+        </w:rPr>
+      </w:pPr>
+      <w:proofErr w:type="spellStart"/>
+      <w:r>
+        <w:rPr>
+          <w:lang w:val="en-GB"/>
+        </w:rPr>
+        <w:lastRenderedPageBreak/>
+        <w:t>Gallade</w:t>
+      </w:r>
+      <w:proofErr w:type="spellEnd"/>
+      <w:r>
+        <w:rPr>
+          <w:lang w:val="en-GB"/>
+        </w:rPr>
+        <w:t xml:space="preserve"> Sixth uses </w:t>
+      </w:r>
+      <w:proofErr w:type="spellStart"/>
+      <w:r>
+        <w:rPr>
+          <w:lang w:val="en-GB"/>
+        </w:rPr>
+        <w:t>DrainingKiss</w:t>
+      </w:r>
+      <w:proofErr w:type="spellEnd"/>
+      <w:r>
+        <w:rPr>
+          <w:lang w:val="en-GB"/>
+        </w:rPr>
+        <w:t xml:space="preserve">. </w:t>
+      </w:r>
+    </w:p>
+    <w:p>
+      <w:pPr>
+        <w:rPr>
+          <w:lang w:val="en-GB"/>
+        </w:rPr>
+      </w:pPr>
+      <w:proofErr w:type="spellStart"/>
+      <w:r>
+        <w:rPr>
+          <w:lang w:val="en-GB"/>
+        </w:rPr>
+        <w:t>Bergmite</w:t>
+      </w:r>
+      <w:proofErr w:type="spellEnd"/>
+      <w:r>
+        <w:rPr>
+          <w:lang w:val="en-GB"/>
+        </w:rPr>
+        <w:t xml:space="preserve"> Second loses 5 hit points.</w:t>
+      </w:r>
+    </w:p>
+    <w:p>
+      <w:pPr>
+        <w:rPr>
+          <w:lang w:val="en-GB"/>
+        </w:rPr>
+      </w:pPr>
+      <w:proofErr w:type="spellStart"/>
+      <w:r>
+        <w:rPr>
+          <w:lang w:val="en-GB"/>
+        </w:rPr>
+        <w:t>Gallade</w:t>
+      </w:r>
+      <w:proofErr w:type="spellEnd"/>
+      <w:r>
+        <w:rPr>
+          <w:lang w:val="en-GB"/>
+        </w:rPr>
+        <w:t xml:space="preserve"> Sixth restores 4 hit points.</w:t>
+      </w:r>
+    </w:p>
+    <w:p>
+      <w:pPr>
+        <w:rPr>
+          <w:lang w:val="en-GB"/>
+        </w:rPr>
+      </w:pPr>
+    </w:p>
+    <w:p>
+      <w:pPr>
+        <w:rPr>
+          <w:lang w:val="en-GB"/>
+        </w:rPr>
+      </w:pPr>
+      <w:proofErr w:type="spellStart"/>
+      <w:r>
+        <w:rPr>
+          <w:lang w:val="en-GB"/>
+        </w:rPr>
+        <w:t>Bergmite</w:t>
+      </w:r>
+      <w:proofErr w:type="spellEnd"/>
+      <w:r>
+        <w:rPr>
+          <w:lang w:val="en-GB"/>
+        </w:rPr>
+        <w:t xml:space="preserve"> Second uses </w:t>
+      </w:r>
+      <w:proofErr w:type="spellStart"/>
+      <w:r>
+        <w:rPr>
+          <w:lang w:val="en-GB"/>
+        </w:rPr>
+        <w:t>IceFang</w:t>
+      </w:r>
+      <w:proofErr w:type="spellEnd"/>
+      <w:r>
+        <w:rPr>
+          <w:lang w:val="en-GB"/>
+        </w:rPr>
+        <w:t xml:space="preserve">. </w:t>
+      </w:r>
+    </w:p>
+    <w:p>
+      <w:pPr>
+        <w:rPr>
+          <w:lang w:val="en-GB"/>
+        </w:rPr>
+      </w:pPr>
+      <w:proofErr w:type="spellStart"/>
+      <w:r>
+        <w:rPr>
+          <w:lang w:val="en-GB"/>
+        </w:rPr>
+        <w:t>Gallade</w:t>
+      </w:r>
+      <w:proofErr w:type="spellEnd"/>
+      <w:r>
+        <w:rPr>
+          <w:lang w:val="en-GB"/>
+        </w:rPr>
+        <w:t xml:space="preserve"> Sixth loses 9 hit points.</w:t>
+      </w:r>
+    </w:p>
+    <w:p>
+      <w:pPr>
+        <w:rPr>
+          <w:lang w:val="en-GB"/>
+        </w:rPr>
+      </w:pPr>
+    </w:p>
+    <w:p>
+      <w:pPr>
+        <w:rPr>
+          <w:lang w:val="en-GB"/>
+        </w:rPr>
+      </w:pPr>
+      <w:proofErr w:type="spellStart"/>
+      <w:r>
+        <w:rPr>
+          <w:lang w:val="en-GB"/>
+        </w:rPr>
+        <w:t>Gallade</w:t>
+      </w:r>
+      <w:proofErr w:type="spellEnd"/>
+      <w:r>
+        <w:rPr>
+          <w:lang w:val="en-GB"/>
+        </w:rPr>
+        <w:t xml:space="preserve"> Sixth uses </w:t>
+      </w:r>
+      <w:proofErr w:type="spellStart"/>
+      <w:r>
+        <w:rPr>
+          <w:lang w:val="en-GB"/>
+        </w:rPr>
+        <w:t>CalmMind</w:t>
+      </w:r>
+      <w:proofErr w:type="spellEnd"/>
+      <w:r>
+        <w:rPr>
+          <w:lang w:val="en-GB"/>
+        </w:rPr>
+        <w:t xml:space="preserve">. </w:t>
+      </w:r>
+    </w:p>
+    <w:p>
+      <w:pPr>
+        <w:rPr>
+          <w:lang w:val="en-GB"/>
+        </w:rPr>
+      </w:pPr>
+      <w:proofErr w:type="spellStart"/>
+      <w:r>
+        <w:rPr>
+          <w:lang w:val="en-GB"/>
+        </w:rPr>
+        <w:t>Gallade</w:t>
+      </w:r>
+      <w:proofErr w:type="spellEnd"/>
+      <w:r>
+        <w:rPr>
+          <w:lang w:val="en-GB"/>
+        </w:rPr>
+        <w:t xml:space="preserve"> Sixth increases special attack.</w:t>
+      </w:r>
+    </w:p>
+    <w:p>
+      <w:pPr>
+        <w:rPr>
+          <w:lang w:val="en-GB"/>
+        </w:rPr>
+      </w:pPr>
+      <w:proofErr w:type="spellStart"/>
+      <w:r>
+        <w:rPr>
+          <w:lang w:val="en-GB"/>
+        </w:rPr>
+        <w:t>Gallade</w:t>
+      </w:r>
+      <w:proofErr w:type="spellEnd"/>
+      <w:r>
+        <w:rPr>
+          <w:lang w:val="en-GB"/>
+        </w:rPr>
+        <w:t xml:space="preserve"> Sixth increases special </w:t>
+      </w:r>
+      <w:proofErr w:type="spellStart"/>
+      <w:r>
+        <w:rPr>
+          <w:lang w:val="en-GB"/>
+        </w:rPr>
+        <w:t>defense</w:t>
+      </w:r>
+      <w:proofErr w:type="spellEnd"/>
+      <w:r>
+        <w:rPr>
+          <w:lang w:val="en-GB"/>
+        </w:rPr>
+        <w:t>.</w:t>
+      </w:r>
+    </w:p>
+    <w:p>
+      <w:pPr>
+        <w:rPr>
+          <w:lang w:val="en-GB"/>
+        </w:rPr>
+      </w:pPr>
+    </w:p>
+    <w:p>
+      <w:pPr>
+        <w:rPr>
+          <w:lang w:val="en-GB"/>
+        </w:rPr>
+      </w:pPr>
+      <w:proofErr w:type="spellStart"/>
+      <w:r>
+        <w:rPr>
+          <w:lang w:val="en-GB"/>
+        </w:rPr>
+        <w:t>Bergmite</w:t>
+      </w:r>
+      <w:proofErr w:type="spellEnd"/>
+      <w:r>
+        <w:rPr>
+          <w:lang w:val="en-GB"/>
+        </w:rPr>
+        <w:t xml:space="preserve"> Second uses </w:t>
+      </w:r>
+      <w:proofErr w:type="spellStart"/>
+      <w:r>
+        <w:rPr>
+          <w:lang w:val="en-GB"/>
+        </w:rPr>
+        <w:t>DoubleEdge</w:t>
+      </w:r>
+      <w:proofErr w:type="spellEnd"/>
+      <w:r>
+        <w:rPr>
+          <w:lang w:val="en-GB"/>
+        </w:rPr>
+        <w:t xml:space="preserve">. </w:t>
+      </w:r>
+    </w:p>
+    <w:p>
+      <w:pPr>
+        <w:rPr>
+          <w:lang w:val="en-GB"/>
+        </w:rPr>
+      </w:pPr>
+      <w:proofErr w:type="spellStart"/>
+      <w:r>
+        <w:rPr>
+          <w:lang w:val="en-GB"/>
+        </w:rPr>
+        <w:t>Gallade</w:t>
+      </w:r>
+      <w:proofErr w:type="spellEnd"/>
+      <w:r>
+        <w:rPr>
+          <w:lang w:val="en-GB"/>
+        </w:rPr>
+        <w:t xml:space="preserve"> Sixth loses 5 hit points.</w:t>
+      </w:r>
+    </w:p>
+    <w:p>
+      <w:pPr>
+        <w:rPr>
+          <w:lang w:val="en-GB"/>
+        </w:rPr>
+      </w:pPr>
+      <w:proofErr w:type="spellStart"/>
+      <w:r>
+        <w:rPr>
+          <w:lang w:val="en-GB"/>
+        </w:rPr>
+        <w:t>Bergmite</w:t>
+      </w:r>
+      <w:proofErr w:type="spellEnd"/>
+      <w:r>
+        <w:rPr>
+          <w:lang w:val="en-GB"/>
+        </w:rPr>
+        <w:t xml:space="preserve"> Second loses 2 hit points.</w:t>
+      </w:r>
+    </w:p>
+    <w:p>
+      <w:pPr>
+        <w:rPr>
+          <w:lang w:val="en-GB"/>
+        </w:rPr>
+      </w:pPr>
+      <w:proofErr w:type="spellStart"/>
+      <w:r>
+        <w:rPr>
+          <w:lang w:val="en-GB"/>
+        </w:rPr>
+        <w:t>Gallade</w:t>
+      </w:r>
+      <w:proofErr w:type="spellEnd"/>
+      <w:r>
+        <w:rPr>
+          <w:lang w:val="en-GB"/>
+        </w:rPr>
+        <w:t xml:space="preserve"> Sixth faints.</w:t>
+      </w:r>
+    </w:p>
+    <w:p>
+      <w:pPr>
+        <w:rPr>
+          <w:lang w:val="en-GB"/>
+        </w:rPr>
+      </w:pPr>
+      <w:r>
+        <w:rPr>
+          <w:lang w:val="en-GB"/>
+        </w:rPr>
+        <w:t xml:space="preserve">Team Purple loses its last </w:t>
+      </w:r>
+      <w:proofErr w:type="spellStart"/>
+      <w:r>
+        <w:rPr>
+          <w:lang w:val="en-GB"/>
+        </w:rPr>
+        <w:t>Pokemon</w:t>
+      </w:r>
+      <w:proofErr w:type="spellEnd"/>
+      <w:r>
+        <w:rPr>
+          <w:lang w:val="en-GB"/>
+        </w:rPr>
+        <w:t>.</w:t>
+      </w:r>
+    </w:p>
+    <w:p>
+      <w:pPr>
+        <w:rPr>
+          <w:lang w:val="en-GB"/>
+        </w:rPr>
+      </w:pPr>
+      <w:r>
+        <w:rPr>
+          <w:lang w:val="en-GB"/>
+        </w:rPr>
+        <w:t>The team Yellow wins the battle!</w:t>
+      </w:r>
+    </w:p>
+    <w:p>
+      <w:pPr>
+        <w:rPr>
+          <w:lang w:val="en-GB"/>
+        </w:rPr>
+      </w:pPr>
+    </w:p>
+    <w:p>
+      <w:pPr>
+        <w:rPr>
+          <w:lang w:val="en-US"/>
+        </w:rPr>
+      </w:pPr>
+    </w:p>
+    <w:p>
+      <w:pPr>
+        <w:rPr>
+          <w:lang w:val="en-US"/>
+        </w:rPr>
+      </w:pPr>
+    </w:p>
+    <w:p>
+      <w:pPr>
+        <w:rPr>
+          <w:lang w:val="en-US"/>
+        </w:rPr>
+      </w:pPr>
+    </w:p>
+    <w:p>
+      <w:pPr>
+        <w:rPr>
+          <w:lang w:val="en-US"/>
+        </w:rPr>
+      </w:pPr>
+    </w:p>
+    <w:p/>
+    <w:p>
+      <w:pPr>
+        <w:pStyle w:val="Heading1"/>
+        <w:jc w:val="center"/>
+        <w:rPr>
+          <w:b/>
+          <w:bCs/>
+        </w:rPr>
+      </w:pPr>
+      <w:bookmarkStart w:id="5" w:name="_Toc210854124"/>
+      <w:r>
+        <w:rPr>
+          <w:b/>
+          <w:bCs/>
+        </w:rPr>
+        <w:lastRenderedPageBreak/>
+        <w:t>Заключение</w:t>
+      </w:r>
+      <w:bookmarkEnd w:id="5"/>
+    </w:p>
+    <w:p>
+      <w:pPr>
+        <w:ind w:firstLine="709"/>
+        <w:jc w:val="both"/>
+      </w:pPr>
+      <w:r>
+        <w:t xml:space="preserve">Во </w:t>
+      </w:r>
+      <w:r>
+        <w:t>время выполнения лабораторной работы я</w:t>
+      </w:r>
+      <w:r>
+        <w:t xml:space="preserve"> </w:t>
+      </w:r>
+      <w:r>
+        <w:t>разобрался с основными принципами ООП</w:t>
+      </w:r>
+      <w:r>
+        <w:t>,</w:t>
+      </w:r>
+      <w:r>
+        <w:t xml:space="preserve"> а также их реализацией в языке </w:t>
+      </w:r>
+      <w:r>
+        <w:rPr>
+          <w:lang w:val="en-US"/>
+        </w:rPr>
+        <w:t>Java</w:t>
+      </w:r>
+      <w:r>
+        <w:t>.</w:t>
+      </w:r>
     </w:p>
     <w:p/>
     <w:p/>
@@ -1193,1966 +3492,6 @@
     <w:p/>
     <w:p/>
     <w:p/>
-    <w:p/>
-    <w:p/>
-    <w:p/>
-    <w:p>
-      <w:pPr>
-        <w:pStyle w:val="Heading2"/>
-        <w:jc w:val="center"/>
-        <w:rPr>
-          <w:lang w:val="en-US"/>
-        </w:rPr>
-      </w:pPr>
-      <w:r>
-        <w:lastRenderedPageBreak/>
-        <w:t>Результат</w:t>
-      </w:r>
-      <w:r>
-        <w:rPr>
-          <w:lang w:val="en-US"/>
-        </w:rPr>
-        <w:t xml:space="preserve"> </w:t>
-      </w:r>
-      <w:r>
-        <w:t>работы</w:t>
-      </w:r>
-      <w:r>
-        <w:rPr>
-          <w:lang w:val="en-US"/>
-        </w:rPr>
-        <w:t xml:space="preserve"> </w:t>
-      </w:r>
-      <w:r>
-        <w:t>программы</w:t>
-      </w:r>
-    </w:p>
-    <w:p>
-      <w:pPr>
-        <w:rPr>
-          <w:lang w:val="en-GB"/>
-        </w:rPr>
-      </w:pPr>
-      <w:proofErr w:type="spellStart"/>
-      <w:r>
-        <w:rPr>
-          <w:lang w:val="en-GB"/>
-        </w:rPr>
-        <w:t>Landorus</w:t>
-      </w:r>
-      <w:proofErr w:type="spellEnd"/>
-      <w:r>
-        <w:rPr>
-          <w:lang w:val="en-GB"/>
-        </w:rPr>
-        <w:t xml:space="preserve"> First from the team Yellow enters the battle!</w:t>
-      </w:r>
-    </w:p>
-    <w:p>
-      <w:pPr>
-        <w:rPr>
-          <w:lang w:val="en-GB"/>
-        </w:rPr>
-      </w:pPr>
-      <w:proofErr w:type="spellStart"/>
-      <w:r>
-        <w:rPr>
-          <w:lang w:val="en-GB"/>
-        </w:rPr>
-        <w:t>Ralts</w:t>
-      </w:r>
-      <w:proofErr w:type="spellEnd"/>
-      <w:r>
-        <w:rPr>
-          <w:lang w:val="en-GB"/>
-        </w:rPr>
-        <w:t xml:space="preserve"> Fourth from the team Purple enters the battle!</w:t>
-      </w:r>
-    </w:p>
-    <w:p>
-      <w:pPr>
-        <w:rPr>
-          <w:lang w:val="en-GB"/>
-        </w:rPr>
-      </w:pPr>
-      <w:proofErr w:type="spellStart"/>
-      <w:r>
-        <w:rPr>
-          <w:lang w:val="en-GB"/>
-        </w:rPr>
-        <w:t>Landorus</w:t>
-      </w:r>
-      <w:proofErr w:type="spellEnd"/>
-      <w:r>
-        <w:rPr>
-          <w:lang w:val="en-GB"/>
-        </w:rPr>
-        <w:t xml:space="preserve"> First uses </w:t>
-      </w:r>
-      <w:proofErr w:type="spellStart"/>
-      <w:r>
-        <w:rPr>
-          <w:lang w:val="en-GB"/>
-        </w:rPr>
-        <w:t>EarthPower</w:t>
-      </w:r>
-      <w:proofErr w:type="spellEnd"/>
-      <w:r>
-        <w:rPr>
-          <w:lang w:val="en-GB"/>
-        </w:rPr>
-        <w:t xml:space="preserve">. </w:t>
-      </w:r>
-    </w:p>
-    <w:p>
-      <w:pPr>
-        <w:rPr>
-          <w:lang w:val="en-GB"/>
-        </w:rPr>
-      </w:pPr>
-      <w:proofErr w:type="spellStart"/>
-      <w:r>
-        <w:rPr>
-          <w:lang w:val="en-GB"/>
-        </w:rPr>
-        <w:t>Ralts</w:t>
-      </w:r>
-      <w:proofErr w:type="spellEnd"/>
-      <w:r>
-        <w:rPr>
-          <w:lang w:val="en-GB"/>
-        </w:rPr>
-        <w:t xml:space="preserve"> Fourth loses 7 hit points.</w:t>
-      </w:r>
-    </w:p>
-    <w:p>
-      <w:pPr>
-        <w:rPr>
-          <w:lang w:val="en-GB"/>
-        </w:rPr>
-      </w:pPr>
-    </w:p>
-    <w:p>
-      <w:pPr>
-        <w:rPr>
-          <w:lang w:val="en-GB"/>
-        </w:rPr>
-      </w:pPr>
-      <w:proofErr w:type="spellStart"/>
-      <w:r>
-        <w:rPr>
-          <w:lang w:val="en-GB"/>
-        </w:rPr>
-        <w:t>Ralts</w:t>
-      </w:r>
-      <w:proofErr w:type="spellEnd"/>
-      <w:r>
-        <w:rPr>
-          <w:lang w:val="en-GB"/>
-        </w:rPr>
-        <w:t xml:space="preserve"> Fourth uses </w:t>
-      </w:r>
-      <w:proofErr w:type="spellStart"/>
-      <w:r>
-        <w:rPr>
-          <w:lang w:val="en-GB"/>
-        </w:rPr>
-        <w:t>CalmMind</w:t>
-      </w:r>
-      <w:proofErr w:type="spellEnd"/>
-      <w:r>
-        <w:rPr>
-          <w:lang w:val="en-GB"/>
-        </w:rPr>
-        <w:t xml:space="preserve">. </w:t>
-      </w:r>
-    </w:p>
-    <w:p>
-      <w:pPr>
-        <w:rPr>
-          <w:lang w:val="en-GB"/>
-        </w:rPr>
-      </w:pPr>
-      <w:proofErr w:type="spellStart"/>
-      <w:r>
-        <w:rPr>
-          <w:lang w:val="en-GB"/>
-        </w:rPr>
-        <w:t>Ralts</w:t>
-      </w:r>
-      <w:proofErr w:type="spellEnd"/>
-      <w:r>
-        <w:rPr>
-          <w:lang w:val="en-GB"/>
-        </w:rPr>
-        <w:t xml:space="preserve"> Fourth increases special attack.</w:t>
-      </w:r>
-    </w:p>
-    <w:p>
-      <w:pPr>
-        <w:rPr>
-          <w:lang w:val="en-GB"/>
-        </w:rPr>
-      </w:pPr>
-      <w:proofErr w:type="spellStart"/>
-      <w:r>
-        <w:rPr>
-          <w:lang w:val="en-GB"/>
-        </w:rPr>
-        <w:t>Ralts</w:t>
-      </w:r>
-      <w:proofErr w:type="spellEnd"/>
-      <w:r>
-        <w:rPr>
-          <w:lang w:val="en-GB"/>
-        </w:rPr>
-        <w:t xml:space="preserve"> Fourth increases special </w:t>
-      </w:r>
-      <w:proofErr w:type="spellStart"/>
-      <w:r>
-        <w:rPr>
-          <w:lang w:val="en-GB"/>
-        </w:rPr>
-        <w:t>defense</w:t>
-      </w:r>
-      <w:proofErr w:type="spellEnd"/>
-      <w:r>
-        <w:rPr>
-          <w:lang w:val="en-GB"/>
-        </w:rPr>
-        <w:t>.</w:t>
-      </w:r>
-    </w:p>
-    <w:p>
-      <w:pPr>
-        <w:rPr>
-          <w:lang w:val="en-GB"/>
-        </w:rPr>
-      </w:pPr>
-    </w:p>
-    <w:p>
-      <w:pPr>
-        <w:rPr>
-          <w:lang w:val="en-GB"/>
-        </w:rPr>
-      </w:pPr>
-      <w:proofErr w:type="spellStart"/>
-      <w:r>
-        <w:rPr>
-          <w:lang w:val="en-GB"/>
-        </w:rPr>
-        <w:t>Landorus</w:t>
-      </w:r>
-      <w:proofErr w:type="spellEnd"/>
-      <w:r>
-        <w:rPr>
-          <w:lang w:val="en-GB"/>
-        </w:rPr>
-        <w:t xml:space="preserve"> First uses </w:t>
-      </w:r>
-      <w:proofErr w:type="spellStart"/>
-      <w:r>
-        <w:rPr>
-          <w:lang w:val="en-GB"/>
-        </w:rPr>
-        <w:t>RockTomb</w:t>
-      </w:r>
-      <w:proofErr w:type="spellEnd"/>
-      <w:r>
-        <w:rPr>
-          <w:lang w:val="en-GB"/>
-        </w:rPr>
-        <w:t xml:space="preserve">. </w:t>
-      </w:r>
-    </w:p>
-    <w:p>
-      <w:pPr>
-        <w:rPr>
-          <w:lang w:val="en-GB"/>
-        </w:rPr>
-      </w:pPr>
-      <w:proofErr w:type="spellStart"/>
-      <w:r>
-        <w:rPr>
-          <w:lang w:val="en-GB"/>
-        </w:rPr>
-        <w:t>Ralts</w:t>
-      </w:r>
-      <w:proofErr w:type="spellEnd"/>
-      <w:r>
-        <w:rPr>
-          <w:lang w:val="en-GB"/>
-        </w:rPr>
-        <w:t xml:space="preserve"> Fourth loses 6 hit points.</w:t>
-      </w:r>
-    </w:p>
-    <w:p>
-      <w:pPr>
-        <w:rPr>
-          <w:lang w:val="en-GB"/>
-        </w:rPr>
-      </w:pPr>
-      <w:proofErr w:type="spellStart"/>
-      <w:r>
-        <w:rPr>
-          <w:lang w:val="en-GB"/>
-        </w:rPr>
-        <w:t>Ralts</w:t>
-      </w:r>
-      <w:proofErr w:type="spellEnd"/>
-      <w:r>
-        <w:rPr>
-          <w:lang w:val="en-GB"/>
-        </w:rPr>
-        <w:t xml:space="preserve"> Fourth decreases speed.</w:t>
-      </w:r>
-    </w:p>
-    <w:p>
-      <w:pPr>
-        <w:rPr>
-          <w:lang w:val="en-GB"/>
-        </w:rPr>
-      </w:pPr>
-      <w:proofErr w:type="spellStart"/>
-      <w:r>
-        <w:rPr>
-          <w:lang w:val="en-GB"/>
-        </w:rPr>
-        <w:t>Ralts</w:t>
-      </w:r>
-      <w:proofErr w:type="spellEnd"/>
-      <w:r>
-        <w:rPr>
-          <w:lang w:val="en-GB"/>
-        </w:rPr>
-        <w:t xml:space="preserve"> Fourth faints.</w:t>
-      </w:r>
-    </w:p>
-    <w:p>
-      <w:pPr>
-        <w:rPr>
-          <w:lang w:val="en-GB"/>
-        </w:rPr>
-      </w:pPr>
-      <w:proofErr w:type="spellStart"/>
-      <w:r>
-        <w:rPr>
-          <w:lang w:val="en-GB"/>
-        </w:rPr>
-        <w:t>Kirlia</w:t>
-      </w:r>
-      <w:proofErr w:type="spellEnd"/>
-      <w:r>
-        <w:rPr>
-          <w:lang w:val="en-GB"/>
-        </w:rPr>
-        <w:t xml:space="preserve"> Fifth from the team Purple enters the battle!</w:t>
-      </w:r>
-    </w:p>
-    <w:p>
-      <w:pPr>
-        <w:rPr>
-          <w:lang w:val="en-GB"/>
-        </w:rPr>
-      </w:pPr>
-      <w:proofErr w:type="spellStart"/>
-      <w:r>
-        <w:rPr>
-          <w:lang w:val="en-GB"/>
-        </w:rPr>
-        <w:t>Landorus</w:t>
-      </w:r>
-      <w:proofErr w:type="spellEnd"/>
-      <w:r>
-        <w:rPr>
-          <w:lang w:val="en-GB"/>
-        </w:rPr>
-        <w:t xml:space="preserve"> First uses </w:t>
-      </w:r>
-      <w:proofErr w:type="spellStart"/>
-      <w:r>
-        <w:rPr>
-          <w:lang w:val="en-GB"/>
-        </w:rPr>
-        <w:t>RockTomb</w:t>
-      </w:r>
-      <w:proofErr w:type="spellEnd"/>
-      <w:r>
-        <w:rPr>
-          <w:lang w:val="en-GB"/>
-        </w:rPr>
-        <w:t xml:space="preserve">. </w:t>
-      </w:r>
-    </w:p>
-    <w:p>
-      <w:pPr>
-        <w:rPr>
-          <w:lang w:val="en-GB"/>
-        </w:rPr>
-      </w:pPr>
-      <w:proofErr w:type="spellStart"/>
-      <w:r>
-        <w:rPr>
-          <w:lang w:val="en-GB"/>
-        </w:rPr>
-        <w:t>Kirlia</w:t>
-      </w:r>
-      <w:proofErr w:type="spellEnd"/>
-      <w:r>
-        <w:rPr>
-          <w:lang w:val="en-GB"/>
-        </w:rPr>
-        <w:t xml:space="preserve"> Fifth loses 3 hit points.</w:t>
-      </w:r>
-    </w:p>
-    <w:p>
-      <w:pPr>
-        <w:rPr>
-          <w:lang w:val="en-GB"/>
-        </w:rPr>
-      </w:pPr>
-      <w:proofErr w:type="spellStart"/>
-      <w:r>
-        <w:rPr>
-          <w:lang w:val="en-GB"/>
-        </w:rPr>
-        <w:t>Kirlia</w:t>
-      </w:r>
-      <w:proofErr w:type="spellEnd"/>
-      <w:r>
-        <w:rPr>
-          <w:lang w:val="en-GB"/>
-        </w:rPr>
-        <w:t xml:space="preserve"> Fifth decreases speed.</w:t>
-      </w:r>
-    </w:p>
-    <w:p>
-      <w:pPr>
-        <w:rPr>
-          <w:lang w:val="en-GB"/>
-        </w:rPr>
-      </w:pPr>
-    </w:p>
-    <w:p>
-      <w:pPr>
-        <w:rPr>
-          <w:lang w:val="en-GB"/>
-        </w:rPr>
-      </w:pPr>
-      <w:proofErr w:type="spellStart"/>
-      <w:r>
-        <w:rPr>
-          <w:lang w:val="en-GB"/>
-        </w:rPr>
-        <w:t>Kirlia</w:t>
-      </w:r>
-      <w:proofErr w:type="spellEnd"/>
-      <w:r>
-        <w:rPr>
-          <w:lang w:val="en-GB"/>
-        </w:rPr>
-        <w:t xml:space="preserve"> Fifth uses </w:t>
-      </w:r>
-      <w:proofErr w:type="spellStart"/>
-      <w:r>
-        <w:rPr>
-          <w:lang w:val="en-GB"/>
-        </w:rPr>
-        <w:t>CalmMind</w:t>
-      </w:r>
-      <w:proofErr w:type="spellEnd"/>
-      <w:r>
-        <w:rPr>
-          <w:lang w:val="en-GB"/>
-        </w:rPr>
-        <w:t xml:space="preserve">. </w:t>
-      </w:r>
-    </w:p>
-    <w:p>
-      <w:pPr>
-        <w:rPr>
-          <w:lang w:val="en-GB"/>
-        </w:rPr>
-      </w:pPr>
-      <w:proofErr w:type="spellStart"/>
-      <w:r>
-        <w:rPr>
-          <w:lang w:val="en-GB"/>
-        </w:rPr>
-        <w:t>Kirlia</w:t>
-      </w:r>
-      <w:proofErr w:type="spellEnd"/>
-      <w:r>
-        <w:rPr>
-          <w:lang w:val="en-GB"/>
-        </w:rPr>
-        <w:t xml:space="preserve"> Fifth increases special attack.</w:t>
-      </w:r>
-    </w:p>
-    <w:p>
-      <w:pPr>
-        <w:rPr>
-          <w:lang w:val="en-GB"/>
-        </w:rPr>
-      </w:pPr>
-      <w:proofErr w:type="spellStart"/>
-      <w:r>
-        <w:rPr>
-          <w:lang w:val="en-GB"/>
-        </w:rPr>
-        <w:t>Kirlia</w:t>
-      </w:r>
-      <w:proofErr w:type="spellEnd"/>
-      <w:r>
-        <w:rPr>
-          <w:lang w:val="en-GB"/>
-        </w:rPr>
-        <w:t xml:space="preserve"> Fifth increases special </w:t>
-      </w:r>
-      <w:proofErr w:type="spellStart"/>
-      <w:r>
-        <w:rPr>
-          <w:lang w:val="en-GB"/>
-        </w:rPr>
-        <w:t>defense</w:t>
-      </w:r>
-      <w:proofErr w:type="spellEnd"/>
-      <w:r>
-        <w:rPr>
-          <w:lang w:val="en-GB"/>
-        </w:rPr>
-        <w:t>.</w:t>
-      </w:r>
-    </w:p>
-    <w:p>
-      <w:pPr>
-        <w:rPr>
-          <w:lang w:val="en-GB"/>
-        </w:rPr>
-      </w:pPr>
-    </w:p>
-    <w:p>
-      <w:pPr>
-        <w:rPr>
-          <w:lang w:val="en-GB"/>
-        </w:rPr>
-      </w:pPr>
-      <w:proofErr w:type="spellStart"/>
-      <w:r>
-        <w:rPr>
-          <w:lang w:val="en-GB"/>
-        </w:rPr>
-        <w:lastRenderedPageBreak/>
-        <w:t>Landorus</w:t>
-      </w:r>
-      <w:proofErr w:type="spellEnd"/>
-      <w:r>
-        <w:rPr>
-          <w:lang w:val="en-GB"/>
-        </w:rPr>
-        <w:t xml:space="preserve"> First uses Rest. </w:t>
-      </w:r>
-    </w:p>
-    <w:p>
-      <w:pPr>
-        <w:rPr>
-          <w:lang w:val="en-GB"/>
-        </w:rPr>
-      </w:pPr>
-      <w:r>
-        <w:rPr>
-          <w:lang w:val="en-GB"/>
-        </w:rPr>
-        <w:t>Health restored</w:t>
-      </w:r>
-    </w:p>
-    <w:p>
-      <w:pPr>
-        <w:rPr>
-          <w:lang w:val="en-GB"/>
-        </w:rPr>
-      </w:pPr>
-      <w:proofErr w:type="spellStart"/>
-      <w:r>
-        <w:rPr>
-          <w:lang w:val="en-GB"/>
-        </w:rPr>
-        <w:t>Landorus</w:t>
-      </w:r>
-      <w:proofErr w:type="spellEnd"/>
-      <w:r>
-        <w:rPr>
-          <w:lang w:val="en-GB"/>
-        </w:rPr>
-        <w:t xml:space="preserve"> First is sleeping</w:t>
-      </w:r>
-    </w:p>
-    <w:p>
-      <w:pPr>
-        <w:rPr>
-          <w:lang w:val="en-GB"/>
-        </w:rPr>
-      </w:pPr>
-    </w:p>
-    <w:p>
-      <w:pPr>
-        <w:rPr>
-          <w:lang w:val="en-GB"/>
-        </w:rPr>
-      </w:pPr>
-      <w:proofErr w:type="spellStart"/>
-      <w:r>
-        <w:rPr>
-          <w:lang w:val="en-GB"/>
-        </w:rPr>
-        <w:t>Kirlia</w:t>
-      </w:r>
-      <w:proofErr w:type="spellEnd"/>
-      <w:r>
-        <w:rPr>
-          <w:lang w:val="en-GB"/>
-        </w:rPr>
-        <w:t xml:space="preserve"> Fifth uses </w:t>
-      </w:r>
-      <w:proofErr w:type="spellStart"/>
-      <w:r>
-        <w:rPr>
-          <w:lang w:val="en-GB"/>
-        </w:rPr>
-        <w:t>CalmMind</w:t>
-      </w:r>
-      <w:proofErr w:type="spellEnd"/>
-      <w:r>
-        <w:rPr>
-          <w:lang w:val="en-GB"/>
-        </w:rPr>
-        <w:t xml:space="preserve">. </w:t>
-      </w:r>
-    </w:p>
-    <w:p>
-      <w:pPr>
-        <w:rPr>
-          <w:lang w:val="en-GB"/>
-        </w:rPr>
-      </w:pPr>
-      <w:proofErr w:type="spellStart"/>
-      <w:r>
-        <w:rPr>
-          <w:lang w:val="en-GB"/>
-        </w:rPr>
-        <w:t>Kirlia</w:t>
-      </w:r>
-      <w:proofErr w:type="spellEnd"/>
-      <w:r>
-        <w:rPr>
-          <w:lang w:val="en-GB"/>
-        </w:rPr>
-        <w:t xml:space="preserve"> Fifth increases special attack.</w:t>
-      </w:r>
-    </w:p>
-    <w:p>
-      <w:pPr>
-        <w:rPr>
-          <w:lang w:val="en-GB"/>
-        </w:rPr>
-      </w:pPr>
-      <w:proofErr w:type="spellStart"/>
-      <w:r>
-        <w:rPr>
-          <w:lang w:val="en-GB"/>
-        </w:rPr>
-        <w:t>Kirlia</w:t>
-      </w:r>
-      <w:proofErr w:type="spellEnd"/>
-      <w:r>
-        <w:rPr>
-          <w:lang w:val="en-GB"/>
-        </w:rPr>
-        <w:t xml:space="preserve"> Fifth increases special </w:t>
-      </w:r>
-      <w:proofErr w:type="spellStart"/>
-      <w:r>
-        <w:rPr>
-          <w:lang w:val="en-GB"/>
-        </w:rPr>
-        <w:t>defense</w:t>
-      </w:r>
-      <w:proofErr w:type="spellEnd"/>
-      <w:r>
-        <w:rPr>
-          <w:lang w:val="en-GB"/>
-        </w:rPr>
-        <w:t>.</w:t>
-      </w:r>
-    </w:p>
-    <w:p>
-      <w:pPr>
-        <w:rPr>
-          <w:lang w:val="en-GB"/>
-        </w:rPr>
-      </w:pPr>
-    </w:p>
-    <w:p>
-      <w:pPr>
-        <w:rPr>
-          <w:lang w:val="en-GB"/>
-        </w:rPr>
-      </w:pPr>
-      <w:proofErr w:type="spellStart"/>
-      <w:r>
-        <w:rPr>
-          <w:lang w:val="en-GB"/>
-        </w:rPr>
-        <w:t>Kirlia</w:t>
-      </w:r>
-      <w:proofErr w:type="spellEnd"/>
-      <w:r>
-        <w:rPr>
-          <w:lang w:val="en-GB"/>
-        </w:rPr>
-        <w:t xml:space="preserve"> Fifth uses </w:t>
-      </w:r>
-      <w:proofErr w:type="spellStart"/>
-      <w:r>
-        <w:rPr>
-          <w:lang w:val="en-GB"/>
-        </w:rPr>
-        <w:t>DrainingKiss</w:t>
-      </w:r>
-      <w:proofErr w:type="spellEnd"/>
-      <w:r>
-        <w:rPr>
-          <w:lang w:val="en-GB"/>
-        </w:rPr>
-        <w:t xml:space="preserve">. </w:t>
-      </w:r>
-    </w:p>
-    <w:p>
-      <w:pPr>
-        <w:rPr>
-          <w:lang w:val="en-GB"/>
-        </w:rPr>
-      </w:pPr>
-      <w:proofErr w:type="spellStart"/>
-      <w:r>
-        <w:rPr>
-          <w:lang w:val="en-GB"/>
-        </w:rPr>
-        <w:t>Landorus</w:t>
-      </w:r>
-      <w:proofErr w:type="spellEnd"/>
-      <w:r>
-        <w:rPr>
-          <w:lang w:val="en-GB"/>
-        </w:rPr>
-        <w:t xml:space="preserve"> First loses 8 hit points.</w:t>
-      </w:r>
-    </w:p>
-    <w:p>
-      <w:pPr>
-        <w:rPr>
-          <w:lang w:val="en-GB"/>
-        </w:rPr>
-      </w:pPr>
-      <w:proofErr w:type="spellStart"/>
-      <w:r>
-        <w:rPr>
-          <w:lang w:val="en-GB"/>
-        </w:rPr>
-        <w:t>Kirlia</w:t>
-      </w:r>
-      <w:proofErr w:type="spellEnd"/>
-      <w:r>
-        <w:rPr>
-          <w:lang w:val="en-GB"/>
-        </w:rPr>
-        <w:t xml:space="preserve"> Fifth restores 6 hit points.</w:t>
-      </w:r>
-    </w:p>
-    <w:p>
-      <w:pPr>
-        <w:rPr>
-          <w:lang w:val="en-GB"/>
-        </w:rPr>
-      </w:pPr>
-    </w:p>
-    <w:p>
-      <w:pPr>
-        <w:rPr>
-          <w:lang w:val="en-GB"/>
-        </w:rPr>
-      </w:pPr>
-    </w:p>
-    <w:p>
-      <w:pPr>
-        <w:rPr>
-          <w:lang w:val="en-GB"/>
-        </w:rPr>
-      </w:pPr>
-      <w:proofErr w:type="spellStart"/>
-      <w:r>
-        <w:rPr>
-          <w:lang w:val="en-GB"/>
-        </w:rPr>
-        <w:t>Landorus</w:t>
-      </w:r>
-      <w:proofErr w:type="spellEnd"/>
-      <w:r>
-        <w:rPr>
-          <w:lang w:val="en-GB"/>
-        </w:rPr>
-        <w:t xml:space="preserve"> First uses </w:t>
-      </w:r>
-      <w:proofErr w:type="spellStart"/>
-      <w:r>
-        <w:rPr>
-          <w:lang w:val="en-GB"/>
-        </w:rPr>
-        <w:t>EarthPower</w:t>
-      </w:r>
-      <w:proofErr w:type="spellEnd"/>
-      <w:r>
-        <w:rPr>
-          <w:lang w:val="en-GB"/>
-        </w:rPr>
-        <w:t xml:space="preserve">. </w:t>
-      </w:r>
-    </w:p>
-    <w:p>
-      <w:pPr>
-        <w:rPr>
-          <w:lang w:val="en-GB"/>
-        </w:rPr>
-      </w:pPr>
-      <w:proofErr w:type="spellStart"/>
-      <w:r>
-        <w:rPr>
-          <w:lang w:val="en-GB"/>
-        </w:rPr>
-        <w:t>Kirlia</w:t>
-      </w:r>
-      <w:proofErr w:type="spellEnd"/>
-      <w:r>
-        <w:rPr>
-          <w:lang w:val="en-GB"/>
-        </w:rPr>
-        <w:t xml:space="preserve"> Fifth loses 10 hit points.</w:t>
-      </w:r>
-    </w:p>
-    <w:p>
-      <w:pPr>
-        <w:rPr>
-          <w:lang w:val="en-GB"/>
-        </w:rPr>
-      </w:pPr>
-    </w:p>
-    <w:p>
-      <w:pPr>
-        <w:rPr>
-          <w:lang w:val="en-GB"/>
-        </w:rPr>
-      </w:pPr>
-      <w:proofErr w:type="spellStart"/>
-      <w:r>
-        <w:rPr>
-          <w:lang w:val="en-GB"/>
-        </w:rPr>
-        <w:t>Kirlia</w:t>
-      </w:r>
-      <w:proofErr w:type="spellEnd"/>
-      <w:r>
-        <w:rPr>
-          <w:lang w:val="en-GB"/>
-        </w:rPr>
-        <w:t xml:space="preserve"> Fifth uses Rest. </w:t>
-      </w:r>
-    </w:p>
-    <w:p>
-      <w:pPr>
-        <w:rPr>
-          <w:lang w:val="en-GB"/>
-        </w:rPr>
-      </w:pPr>
-      <w:r>
-        <w:rPr>
-          <w:lang w:val="en-GB"/>
-        </w:rPr>
-        <w:t>Health restored</w:t>
-      </w:r>
-    </w:p>
-    <w:p>
-      <w:pPr>
-        <w:rPr>
-          <w:lang w:val="en-GB"/>
-        </w:rPr>
-      </w:pPr>
-      <w:proofErr w:type="spellStart"/>
-      <w:r>
-        <w:rPr>
-          <w:lang w:val="en-GB"/>
-        </w:rPr>
-        <w:t>Kirlia</w:t>
-      </w:r>
-      <w:proofErr w:type="spellEnd"/>
-      <w:r>
-        <w:rPr>
-          <w:lang w:val="en-GB"/>
-        </w:rPr>
-        <w:t xml:space="preserve"> Fifth is sleeping</w:t>
-      </w:r>
-    </w:p>
-    <w:p>
-      <w:pPr>
-        <w:rPr>
-          <w:lang w:val="en-GB"/>
-        </w:rPr>
-      </w:pPr>
-    </w:p>
-    <w:p>
-      <w:pPr>
-        <w:rPr>
-          <w:lang w:val="en-GB"/>
-        </w:rPr>
-      </w:pPr>
-      <w:proofErr w:type="spellStart"/>
-      <w:r>
-        <w:rPr>
-          <w:lang w:val="en-GB"/>
-        </w:rPr>
-        <w:t>Landorus</w:t>
-      </w:r>
-      <w:proofErr w:type="spellEnd"/>
-      <w:r>
-        <w:rPr>
-          <w:lang w:val="en-GB"/>
-        </w:rPr>
-        <w:t xml:space="preserve"> First uses </w:t>
-      </w:r>
-      <w:proofErr w:type="spellStart"/>
-      <w:r>
-        <w:rPr>
-          <w:lang w:val="en-GB"/>
-        </w:rPr>
-        <w:t>EarthPower</w:t>
-      </w:r>
-      <w:proofErr w:type="spellEnd"/>
-      <w:r>
-        <w:rPr>
-          <w:lang w:val="en-GB"/>
-        </w:rPr>
-        <w:t xml:space="preserve">. </w:t>
-      </w:r>
-    </w:p>
-    <w:p>
-      <w:pPr>
-        <w:rPr>
-          <w:lang w:val="en-GB"/>
-        </w:rPr>
-      </w:pPr>
-      <w:proofErr w:type="spellStart"/>
-      <w:r>
-        <w:rPr>
-          <w:lang w:val="en-GB"/>
-        </w:rPr>
-        <w:t>Kirlia</w:t>
-      </w:r>
-      <w:proofErr w:type="spellEnd"/>
-      <w:r>
-        <w:rPr>
-          <w:lang w:val="en-GB"/>
-        </w:rPr>
-        <w:t xml:space="preserve"> Fifth loses 8 hit points.</w:t>
-      </w:r>
-    </w:p>
-    <w:p>
-      <w:pPr>
-        <w:rPr>
-          <w:lang w:val="en-GB"/>
-        </w:rPr>
-      </w:pPr>
-    </w:p>
-    <w:p>
-      <w:pPr>
-        <w:rPr>
-          <w:lang w:val="en-GB"/>
-        </w:rPr>
-      </w:pPr>
-    </w:p>
-    <w:p>
-      <w:pPr>
-        <w:rPr>
-          <w:lang w:val="en-GB"/>
-        </w:rPr>
-      </w:pPr>
-      <w:proofErr w:type="spellStart"/>
-      <w:r>
-        <w:rPr>
-          <w:lang w:val="en-GB"/>
-        </w:rPr>
-        <w:t>Landorus</w:t>
-      </w:r>
-      <w:proofErr w:type="spellEnd"/>
-      <w:r>
-        <w:rPr>
-          <w:lang w:val="en-GB"/>
-        </w:rPr>
-        <w:t xml:space="preserve"> First uses </w:t>
-      </w:r>
-      <w:proofErr w:type="spellStart"/>
-      <w:r>
-        <w:rPr>
-          <w:lang w:val="en-GB"/>
-        </w:rPr>
-        <w:t>BrutalSwing</w:t>
-      </w:r>
-      <w:proofErr w:type="spellEnd"/>
-      <w:r>
-        <w:rPr>
-          <w:lang w:val="en-GB"/>
-        </w:rPr>
-        <w:t xml:space="preserve">. </w:t>
-      </w:r>
-    </w:p>
-    <w:p>
-      <w:pPr>
-        <w:rPr>
-          <w:lang w:val="en-GB"/>
-        </w:rPr>
-      </w:pPr>
-      <w:proofErr w:type="spellStart"/>
-      <w:r>
-        <w:rPr>
-          <w:lang w:val="en-GB"/>
-        </w:rPr>
-        <w:t>Kirlia</w:t>
-      </w:r>
-      <w:proofErr w:type="spellEnd"/>
-      <w:r>
-        <w:rPr>
-          <w:lang w:val="en-GB"/>
-        </w:rPr>
-        <w:t xml:space="preserve"> Fifth loses 4 hit points.</w:t>
-      </w:r>
-    </w:p>
-    <w:p>
-      <w:pPr>
-        <w:rPr>
-          <w:lang w:val="en-GB"/>
-        </w:rPr>
-      </w:pPr>
-      <w:proofErr w:type="spellStart"/>
-      <w:r>
-        <w:rPr>
-          <w:lang w:val="en-GB"/>
-        </w:rPr>
-        <w:t>Kirlia</w:t>
-      </w:r>
-      <w:proofErr w:type="spellEnd"/>
-      <w:r>
-        <w:rPr>
-          <w:lang w:val="en-GB"/>
-        </w:rPr>
-        <w:t xml:space="preserve"> Fifth faints.</w:t>
-      </w:r>
-    </w:p>
-    <w:p>
-      <w:pPr>
-        <w:rPr>
-          <w:lang w:val="en-GB"/>
-        </w:rPr>
-      </w:pPr>
-      <w:proofErr w:type="spellStart"/>
-      <w:r>
-        <w:rPr>
-          <w:lang w:val="en-GB"/>
-        </w:rPr>
-        <w:t>Gallade</w:t>
-      </w:r>
-      <w:proofErr w:type="spellEnd"/>
-      <w:r>
-        <w:rPr>
-          <w:lang w:val="en-GB"/>
-        </w:rPr>
-        <w:t xml:space="preserve"> Sixth from the team Purple enters the battle!</w:t>
-      </w:r>
-    </w:p>
-    <w:p>
-      <w:pPr>
-        <w:rPr>
-          <w:lang w:val="en-GB"/>
-        </w:rPr>
-      </w:pPr>
-      <w:proofErr w:type="spellStart"/>
-      <w:r>
-        <w:rPr>
-          <w:lang w:val="en-GB"/>
-        </w:rPr>
-        <w:t>Landorus</w:t>
-      </w:r>
-      <w:proofErr w:type="spellEnd"/>
-      <w:r>
-        <w:rPr>
-          <w:lang w:val="en-GB"/>
-        </w:rPr>
-        <w:t xml:space="preserve"> First uses </w:t>
-      </w:r>
-      <w:proofErr w:type="spellStart"/>
-      <w:r>
-        <w:rPr>
-          <w:lang w:val="en-GB"/>
-        </w:rPr>
-        <w:t>BrutalSwing</w:t>
-      </w:r>
-      <w:proofErr w:type="spellEnd"/>
-      <w:r>
-        <w:rPr>
-          <w:lang w:val="en-GB"/>
-        </w:rPr>
-        <w:t xml:space="preserve">. </w:t>
-      </w:r>
-    </w:p>
-    <w:p>
-      <w:pPr>
-        <w:rPr>
-          <w:lang w:val="en-GB"/>
-        </w:rPr>
-      </w:pPr>
-      <w:proofErr w:type="spellStart"/>
-      <w:r>
-        <w:rPr>
-          <w:lang w:val="en-GB"/>
-        </w:rPr>
-        <w:t>Gallade</w:t>
-      </w:r>
-      <w:proofErr w:type="spellEnd"/>
-      <w:r>
-        <w:rPr>
-          <w:lang w:val="en-GB"/>
-        </w:rPr>
-        <w:t xml:space="preserve"> Sixth loses 5 hit points.</w:t>
-      </w:r>
-    </w:p>
-    <w:p>
-      <w:pPr>
-        <w:rPr>
-          <w:lang w:val="en-GB"/>
-        </w:rPr>
-      </w:pPr>
-    </w:p>
-    <w:p>
-      <w:pPr>
-        <w:rPr>
-          <w:lang w:val="en-GB"/>
-        </w:rPr>
-      </w:pPr>
-      <w:proofErr w:type="spellStart"/>
-      <w:r>
-        <w:rPr>
-          <w:lang w:val="en-GB"/>
-        </w:rPr>
-        <w:t>Gallade</w:t>
-      </w:r>
-      <w:proofErr w:type="spellEnd"/>
-      <w:r>
-        <w:rPr>
-          <w:lang w:val="en-GB"/>
-        </w:rPr>
-        <w:t xml:space="preserve"> Sixth uses Confide. </w:t>
-      </w:r>
-    </w:p>
-    <w:p>
-      <w:pPr>
-        <w:rPr>
-          <w:lang w:val="en-GB"/>
-        </w:rPr>
-      </w:pPr>
-      <w:proofErr w:type="spellStart"/>
-      <w:r>
-        <w:rPr>
-          <w:lang w:val="en-GB"/>
-        </w:rPr>
-        <w:t>Landorus</w:t>
-      </w:r>
-      <w:proofErr w:type="spellEnd"/>
-      <w:r>
-        <w:rPr>
-          <w:lang w:val="en-GB"/>
-        </w:rPr>
-        <w:t xml:space="preserve"> First decreases special attack.</w:t>
-      </w:r>
-    </w:p>
-    <w:p>
-      <w:pPr>
-        <w:rPr>
-          <w:lang w:val="en-GB"/>
-        </w:rPr>
-      </w:pPr>
-    </w:p>
-    <w:p>
-      <w:pPr>
-        <w:rPr>
-          <w:lang w:val="en-GB"/>
-        </w:rPr>
-      </w:pPr>
-      <w:proofErr w:type="spellStart"/>
-      <w:r>
-        <w:rPr>
-          <w:lang w:val="en-GB"/>
-        </w:rPr>
-        <w:t>Landorus</w:t>
-      </w:r>
-      <w:proofErr w:type="spellEnd"/>
-      <w:r>
-        <w:rPr>
-          <w:lang w:val="en-GB"/>
-        </w:rPr>
-        <w:t xml:space="preserve"> First uses </w:t>
-      </w:r>
-      <w:proofErr w:type="spellStart"/>
-      <w:r>
-        <w:rPr>
-          <w:lang w:val="en-GB"/>
-        </w:rPr>
-        <w:t>RockTomb</w:t>
-      </w:r>
-      <w:proofErr w:type="spellEnd"/>
-      <w:r>
-        <w:rPr>
-          <w:lang w:val="en-GB"/>
-        </w:rPr>
-        <w:t xml:space="preserve">. </w:t>
-      </w:r>
-    </w:p>
-    <w:p>
-      <w:pPr>
-        <w:rPr>
-          <w:lang w:val="en-GB"/>
-        </w:rPr>
-      </w:pPr>
-      <w:proofErr w:type="spellStart"/>
-      <w:r>
-        <w:rPr>
-          <w:lang w:val="en-GB"/>
-        </w:rPr>
-        <w:t>Gallade</w:t>
-      </w:r>
-      <w:proofErr w:type="spellEnd"/>
-      <w:r>
-        <w:rPr>
-          <w:lang w:val="en-GB"/>
-        </w:rPr>
-        <w:t xml:space="preserve"> Sixth loses 2 hit points.</w:t>
-      </w:r>
-    </w:p>
-    <w:p>
-      <w:pPr>
-        <w:rPr>
-          <w:lang w:val="en-GB"/>
-        </w:rPr>
-      </w:pPr>
-      <w:proofErr w:type="spellStart"/>
-      <w:r>
-        <w:rPr>
-          <w:lang w:val="en-GB"/>
-        </w:rPr>
-        <w:t>Gallade</w:t>
-      </w:r>
-      <w:proofErr w:type="spellEnd"/>
-      <w:r>
-        <w:rPr>
-          <w:lang w:val="en-GB"/>
-        </w:rPr>
-        <w:t xml:space="preserve"> Sixth decreases speed.</w:t>
-      </w:r>
-    </w:p>
-    <w:p>
-      <w:pPr>
-        <w:rPr>
-          <w:lang w:val="en-GB"/>
-        </w:rPr>
-      </w:pPr>
-    </w:p>
-    <w:p>
-      <w:pPr>
-        <w:rPr>
-          <w:lang w:val="en-GB"/>
-        </w:rPr>
-      </w:pPr>
-      <w:proofErr w:type="spellStart"/>
-      <w:r>
-        <w:rPr>
-          <w:lang w:val="en-GB"/>
-        </w:rPr>
-        <w:t>Gallade</w:t>
-      </w:r>
-      <w:proofErr w:type="spellEnd"/>
-      <w:r>
-        <w:rPr>
-          <w:lang w:val="en-GB"/>
-        </w:rPr>
-        <w:t xml:space="preserve"> Sixth uses Confide. </w:t>
-      </w:r>
-    </w:p>
-    <w:p>
-      <w:pPr>
-        <w:rPr>
-          <w:lang w:val="en-GB"/>
-        </w:rPr>
-      </w:pPr>
-      <w:proofErr w:type="spellStart"/>
-      <w:r>
-        <w:rPr>
-          <w:lang w:val="en-GB"/>
-        </w:rPr>
-        <w:t>Landorus</w:t>
-      </w:r>
-      <w:proofErr w:type="spellEnd"/>
-      <w:r>
-        <w:rPr>
-          <w:lang w:val="en-GB"/>
-        </w:rPr>
-        <w:t xml:space="preserve"> First decreases special attack.</w:t>
-      </w:r>
-    </w:p>
-    <w:p>
-      <w:pPr>
-        <w:rPr>
-          <w:lang w:val="en-GB"/>
-        </w:rPr>
-      </w:pPr>
-    </w:p>
-    <w:p>
-      <w:pPr>
-        <w:rPr>
-          <w:lang w:val="en-GB"/>
-        </w:rPr>
-      </w:pPr>
-      <w:proofErr w:type="spellStart"/>
-      <w:r>
-        <w:rPr>
-          <w:lang w:val="en-GB"/>
-        </w:rPr>
-        <w:t>Gallade</w:t>
-      </w:r>
-      <w:proofErr w:type="spellEnd"/>
-      <w:r>
-        <w:rPr>
-          <w:lang w:val="en-GB"/>
-        </w:rPr>
-        <w:t xml:space="preserve"> Sixth uses </w:t>
-      </w:r>
-      <w:proofErr w:type="spellStart"/>
-      <w:r>
-        <w:rPr>
-          <w:lang w:val="en-GB"/>
-        </w:rPr>
-        <w:t>DrainingKiss</w:t>
-      </w:r>
-      <w:proofErr w:type="spellEnd"/>
-      <w:r>
-        <w:rPr>
-          <w:lang w:val="en-GB"/>
-        </w:rPr>
-        <w:t xml:space="preserve">. </w:t>
-      </w:r>
-    </w:p>
-    <w:p>
-      <w:pPr>
-        <w:rPr>
-          <w:lang w:val="en-GB"/>
-        </w:rPr>
-      </w:pPr>
-      <w:proofErr w:type="spellStart"/>
-      <w:r>
-        <w:rPr>
-          <w:lang w:val="en-GB"/>
-        </w:rPr>
-        <w:t>Landorus</w:t>
-      </w:r>
-      <w:proofErr w:type="spellEnd"/>
-      <w:r>
-        <w:rPr>
-          <w:lang w:val="en-GB"/>
-        </w:rPr>
-        <w:t xml:space="preserve"> First loses 5 hit points.</w:t>
-      </w:r>
-    </w:p>
-    <w:p>
-      <w:pPr>
-        <w:rPr>
-          <w:lang w:val="en-GB"/>
-        </w:rPr>
-      </w:pPr>
-      <w:proofErr w:type="spellStart"/>
-      <w:r>
-        <w:rPr>
-          <w:lang w:val="en-GB"/>
-        </w:rPr>
-        <w:t>Gallade</w:t>
-      </w:r>
-      <w:proofErr w:type="spellEnd"/>
-      <w:r>
-        <w:rPr>
-          <w:lang w:val="en-GB"/>
-        </w:rPr>
-        <w:t xml:space="preserve"> Sixth restores 4 hit points.</w:t>
-      </w:r>
-    </w:p>
-    <w:p>
-      <w:pPr>
-        <w:rPr>
-          <w:lang w:val="en-GB"/>
-        </w:rPr>
-      </w:pPr>
-      <w:proofErr w:type="spellStart"/>
-      <w:r>
-        <w:rPr>
-          <w:lang w:val="en-GB"/>
-        </w:rPr>
-        <w:t>Landorus</w:t>
-      </w:r>
-      <w:proofErr w:type="spellEnd"/>
-      <w:r>
-        <w:rPr>
-          <w:lang w:val="en-GB"/>
-        </w:rPr>
-        <w:t xml:space="preserve"> First faints.</w:t>
-      </w:r>
-    </w:p>
-    <w:p>
-      <w:pPr>
-        <w:rPr>
-          <w:lang w:val="en-GB"/>
-        </w:rPr>
-      </w:pPr>
-      <w:proofErr w:type="spellStart"/>
-      <w:r>
-        <w:rPr>
-          <w:lang w:val="en-GB"/>
-        </w:rPr>
-        <w:t>Bergmite</w:t>
-      </w:r>
-      <w:proofErr w:type="spellEnd"/>
-      <w:r>
-        <w:rPr>
-          <w:lang w:val="en-GB"/>
-        </w:rPr>
-        <w:t xml:space="preserve"> Second from the team Yellow enters the battle!</w:t>
-      </w:r>
-    </w:p>
-    <w:p>
-      <w:pPr>
-        <w:rPr>
-          <w:lang w:val="en-GB"/>
-        </w:rPr>
-      </w:pPr>
-      <w:proofErr w:type="spellStart"/>
-      <w:r>
-        <w:rPr>
-          <w:lang w:val="en-GB"/>
-        </w:rPr>
-        <w:lastRenderedPageBreak/>
-        <w:t>Gallade</w:t>
-      </w:r>
-      <w:proofErr w:type="spellEnd"/>
-      <w:r>
-        <w:rPr>
-          <w:lang w:val="en-GB"/>
-        </w:rPr>
-        <w:t xml:space="preserve"> Sixth uses </w:t>
-      </w:r>
-      <w:proofErr w:type="spellStart"/>
-      <w:r>
-        <w:rPr>
-          <w:lang w:val="en-GB"/>
-        </w:rPr>
-        <w:t>DrainingKiss</w:t>
-      </w:r>
-      <w:proofErr w:type="spellEnd"/>
-      <w:r>
-        <w:rPr>
-          <w:lang w:val="en-GB"/>
-        </w:rPr>
-        <w:t xml:space="preserve">. </w:t>
-      </w:r>
-    </w:p>
-    <w:p>
-      <w:pPr>
-        <w:rPr>
-          <w:lang w:val="en-GB"/>
-        </w:rPr>
-      </w:pPr>
-      <w:proofErr w:type="spellStart"/>
-      <w:r>
-        <w:rPr>
-          <w:lang w:val="en-GB"/>
-        </w:rPr>
-        <w:t>Bergmite</w:t>
-      </w:r>
-      <w:proofErr w:type="spellEnd"/>
-      <w:r>
-        <w:rPr>
-          <w:lang w:val="en-GB"/>
-        </w:rPr>
-        <w:t xml:space="preserve"> Second loses 5 hit points.</w:t>
-      </w:r>
-    </w:p>
-    <w:p>
-      <w:pPr>
-        <w:rPr>
-          <w:lang w:val="en-GB"/>
-        </w:rPr>
-      </w:pPr>
-      <w:proofErr w:type="spellStart"/>
-      <w:r>
-        <w:rPr>
-          <w:lang w:val="en-GB"/>
-        </w:rPr>
-        <w:t>Gallade</w:t>
-      </w:r>
-      <w:proofErr w:type="spellEnd"/>
-      <w:r>
-        <w:rPr>
-          <w:lang w:val="en-GB"/>
-        </w:rPr>
-        <w:t xml:space="preserve"> Sixth restores 4 hit points.</w:t>
-      </w:r>
-    </w:p>
-    <w:p>
-      <w:pPr>
-        <w:rPr>
-          <w:lang w:val="en-GB"/>
-        </w:rPr>
-      </w:pPr>
-    </w:p>
-    <w:p>
-      <w:pPr>
-        <w:rPr>
-          <w:lang w:val="en-GB"/>
-        </w:rPr>
-      </w:pPr>
-      <w:proofErr w:type="spellStart"/>
-      <w:r>
-        <w:rPr>
-          <w:lang w:val="en-GB"/>
-        </w:rPr>
-        <w:t>Bergmite</w:t>
-      </w:r>
-      <w:proofErr w:type="spellEnd"/>
-      <w:r>
-        <w:rPr>
-          <w:lang w:val="en-GB"/>
-        </w:rPr>
-        <w:t xml:space="preserve"> Second uses </w:t>
-      </w:r>
-      <w:proofErr w:type="spellStart"/>
-      <w:r>
-        <w:rPr>
-          <w:lang w:val="en-GB"/>
-        </w:rPr>
-        <w:t>IceFang</w:t>
-      </w:r>
-      <w:proofErr w:type="spellEnd"/>
-      <w:r>
-        <w:rPr>
-          <w:lang w:val="en-GB"/>
-        </w:rPr>
-        <w:t xml:space="preserve">. </w:t>
-      </w:r>
-    </w:p>
-    <w:p>
-      <w:pPr>
-        <w:rPr>
-          <w:lang w:val="en-GB"/>
-        </w:rPr>
-      </w:pPr>
-      <w:proofErr w:type="spellStart"/>
-      <w:r>
-        <w:rPr>
-          <w:lang w:val="en-GB"/>
-        </w:rPr>
-        <w:t>Gallade</w:t>
-      </w:r>
-      <w:proofErr w:type="spellEnd"/>
-      <w:r>
-        <w:rPr>
-          <w:lang w:val="en-GB"/>
-        </w:rPr>
-        <w:t xml:space="preserve"> Sixth loses 9 hit points.</w:t>
-      </w:r>
-    </w:p>
-    <w:p>
-      <w:pPr>
-        <w:rPr>
-          <w:lang w:val="en-GB"/>
-        </w:rPr>
-      </w:pPr>
-    </w:p>
-    <w:p>
-      <w:pPr>
-        <w:rPr>
-          <w:lang w:val="en-GB"/>
-        </w:rPr>
-      </w:pPr>
-      <w:proofErr w:type="spellStart"/>
-      <w:r>
-        <w:rPr>
-          <w:lang w:val="en-GB"/>
-        </w:rPr>
-        <w:t>Gallade</w:t>
-      </w:r>
-      <w:proofErr w:type="spellEnd"/>
-      <w:r>
-        <w:rPr>
-          <w:lang w:val="en-GB"/>
-        </w:rPr>
-        <w:t xml:space="preserve"> Sixth uses </w:t>
-      </w:r>
-      <w:proofErr w:type="spellStart"/>
-      <w:r>
-        <w:rPr>
-          <w:lang w:val="en-GB"/>
-        </w:rPr>
-        <w:t>CalmMind</w:t>
-      </w:r>
-      <w:proofErr w:type="spellEnd"/>
-      <w:r>
-        <w:rPr>
-          <w:lang w:val="en-GB"/>
-        </w:rPr>
-        <w:t xml:space="preserve">. </w:t>
-      </w:r>
-    </w:p>
-    <w:p>
-      <w:pPr>
-        <w:rPr>
-          <w:lang w:val="en-GB"/>
-        </w:rPr>
-      </w:pPr>
-      <w:proofErr w:type="spellStart"/>
-      <w:r>
-        <w:rPr>
-          <w:lang w:val="en-GB"/>
-        </w:rPr>
-        <w:t>Gallade</w:t>
-      </w:r>
-      <w:proofErr w:type="spellEnd"/>
-      <w:r>
-        <w:rPr>
-          <w:lang w:val="en-GB"/>
-        </w:rPr>
-        <w:t xml:space="preserve"> Sixth increases special attack.</w:t>
-      </w:r>
-    </w:p>
-    <w:p>
-      <w:pPr>
-        <w:rPr>
-          <w:lang w:val="en-GB"/>
-        </w:rPr>
-      </w:pPr>
-      <w:proofErr w:type="spellStart"/>
-      <w:r>
-        <w:rPr>
-          <w:lang w:val="en-GB"/>
-        </w:rPr>
-        <w:t>Gallade</w:t>
-      </w:r>
-      <w:proofErr w:type="spellEnd"/>
-      <w:r>
-        <w:rPr>
-          <w:lang w:val="en-GB"/>
-        </w:rPr>
-        <w:t xml:space="preserve"> Sixth increases special </w:t>
-      </w:r>
-      <w:proofErr w:type="spellStart"/>
-      <w:r>
-        <w:rPr>
-          <w:lang w:val="en-GB"/>
-        </w:rPr>
-        <w:t>defense</w:t>
-      </w:r>
-      <w:proofErr w:type="spellEnd"/>
-      <w:r>
-        <w:rPr>
-          <w:lang w:val="en-GB"/>
-        </w:rPr>
-        <w:t>.</w:t>
-      </w:r>
-    </w:p>
-    <w:p>
-      <w:pPr>
-        <w:rPr>
-          <w:lang w:val="en-GB"/>
-        </w:rPr>
-      </w:pPr>
-    </w:p>
-    <w:p>
-      <w:pPr>
-        <w:rPr>
-          <w:lang w:val="en-GB"/>
-        </w:rPr>
-      </w:pPr>
-      <w:proofErr w:type="spellStart"/>
-      <w:r>
-        <w:rPr>
-          <w:lang w:val="en-GB"/>
-        </w:rPr>
-        <w:t>Bergmite</w:t>
-      </w:r>
-      <w:proofErr w:type="spellEnd"/>
-      <w:r>
-        <w:rPr>
-          <w:lang w:val="en-GB"/>
-        </w:rPr>
-        <w:t xml:space="preserve"> Second uses </w:t>
-      </w:r>
-      <w:proofErr w:type="spellStart"/>
-      <w:r>
-        <w:rPr>
-          <w:lang w:val="en-GB"/>
-        </w:rPr>
-        <w:t>DoubleEdge</w:t>
-      </w:r>
-      <w:proofErr w:type="spellEnd"/>
-      <w:r>
-        <w:rPr>
-          <w:lang w:val="en-GB"/>
-        </w:rPr>
-        <w:t xml:space="preserve">. </w:t>
-      </w:r>
-    </w:p>
-    <w:p>
-      <w:pPr>
-        <w:rPr>
-          <w:lang w:val="en-GB"/>
-        </w:rPr>
-      </w:pPr>
-      <w:proofErr w:type="spellStart"/>
-      <w:r>
-        <w:rPr>
-          <w:lang w:val="en-GB"/>
-        </w:rPr>
-        <w:t>Gallade</w:t>
-      </w:r>
-      <w:proofErr w:type="spellEnd"/>
-      <w:r>
-        <w:rPr>
-          <w:lang w:val="en-GB"/>
-        </w:rPr>
-        <w:t xml:space="preserve"> Sixth loses 5 hit points.</w:t>
-      </w:r>
-    </w:p>
-    <w:p>
-      <w:pPr>
-        <w:rPr>
-          <w:lang w:val="en-GB"/>
-        </w:rPr>
-      </w:pPr>
-      <w:proofErr w:type="spellStart"/>
-      <w:r>
-        <w:rPr>
-          <w:lang w:val="en-GB"/>
-        </w:rPr>
-        <w:t>Bergmite</w:t>
-      </w:r>
-      <w:proofErr w:type="spellEnd"/>
-      <w:r>
-        <w:rPr>
-          <w:lang w:val="en-GB"/>
-        </w:rPr>
-        <w:t xml:space="preserve"> Second loses 2 hit points.</w:t>
-      </w:r>
-    </w:p>
-    <w:p>
-      <w:pPr>
-        <w:rPr>
-          <w:lang w:val="en-GB"/>
-        </w:rPr>
-      </w:pPr>
-      <w:proofErr w:type="spellStart"/>
-      <w:r>
-        <w:rPr>
-          <w:lang w:val="en-GB"/>
-        </w:rPr>
-        <w:t>Gallade</w:t>
-      </w:r>
-      <w:proofErr w:type="spellEnd"/>
-      <w:r>
-        <w:rPr>
-          <w:lang w:val="en-GB"/>
-        </w:rPr>
-        <w:t xml:space="preserve"> Sixth faints.</w:t>
-      </w:r>
-    </w:p>
-    <w:p>
-      <w:pPr>
-        <w:rPr>
-          <w:lang w:val="en-GB"/>
-        </w:rPr>
-      </w:pPr>
-      <w:r>
-        <w:rPr>
-          <w:lang w:val="en-GB"/>
-        </w:rPr>
-        <w:t xml:space="preserve">Team Purple loses its last </w:t>
-      </w:r>
-      <w:proofErr w:type="spellStart"/>
-      <w:r>
-        <w:rPr>
-          <w:lang w:val="en-GB"/>
-        </w:rPr>
-        <w:t>Pokemon</w:t>
-      </w:r>
-      <w:proofErr w:type="spellEnd"/>
-      <w:r>
-        <w:rPr>
-          <w:lang w:val="en-GB"/>
-        </w:rPr>
-        <w:t>.</w:t>
-      </w:r>
-    </w:p>
-    <w:p>
-      <w:pPr>
-        <w:rPr>
-          <w:lang w:val="en-GB"/>
-        </w:rPr>
-      </w:pPr>
-      <w:r>
-        <w:rPr>
-          <w:lang w:val="en-GB"/>
-        </w:rPr>
-        <w:t>The team Yellow wins the battle!</w:t>
-      </w:r>
-    </w:p>
-    <w:p>
-      <w:pPr>
-        <w:rPr>
-          <w:lang w:val="en-GB"/>
-        </w:rPr>
-      </w:pPr>
-    </w:p>
-    <w:p>
-      <w:pPr>
-        <w:rPr>
-          <w:lang w:val="en-US"/>
-        </w:rPr>
-      </w:pPr>
-    </w:p>
-    <w:p>
-      <w:pPr>
-        <w:rPr>
-          <w:lang w:val="en-US"/>
-        </w:rPr>
-      </w:pPr>
-    </w:p>
-    <w:p>
-      <w:pPr>
-        <w:rPr>
-          <w:lang w:val="en-US"/>
-        </w:rPr>
-      </w:pPr>
-    </w:p>
-    <w:p>
-      <w:pPr>
-        <w:rPr>
-          <w:lang w:val="en-US"/>
-        </w:rPr>
-      </w:pPr>
-    </w:p>
-    <w:p>
-      <w:pPr>
-        <w:rPr>
-          <w:lang w:val="en-US"/>
-        </w:rPr>
-      </w:pPr>
-    </w:p>
-    <w:p>
-      <w:pPr>
-        <w:pStyle w:val="Heading1"/>
-        <w:jc w:val="both"/>
-        <w:rPr>
-          <w:b/>
-          <w:bCs/>
-          <w:lang w:val="en-US"/>
-        </w:rPr>
-      </w:pPr>
-    </w:p>
-    <w:p>
-      <w:pPr>
-        <w:rPr>
-          <w:lang w:val="en-US"/>
-        </w:rPr>
-      </w:pPr>
-    </w:p>
-    <w:p>
-      <w:pPr>
-        <w:pStyle w:val="Heading1"/>
-        <w:jc w:val="center"/>
-        <w:rPr>
-          <w:b/>
-          <w:bCs/>
-        </w:rPr>
-      </w:pPr>
-      <w:r>
-        <w:rPr>
-          <w:b/>
-          <w:bCs/>
-        </w:rPr>
-        <w:t>Заключение</w:t>
-      </w:r>
-      <w:bookmarkEnd w:id="2"/>
-    </w:p>
-    <w:p>
-      <w:pPr>
-        <w:ind w:firstLine="709"/>
-        <w:jc w:val="both"/>
-      </w:pPr>
-      <w:r>
-        <w:t xml:space="preserve">Во </w:t>
-      </w:r>
-      <w:r>
-        <w:t>время выполнения лабораторной работы я</w:t>
-      </w:r>
-      <w:r>
-        <w:t xml:space="preserve"> </w:t>
-      </w:r>
-      <w:r>
-        <w:t>разобрался с основными принципами ООП</w:t>
-      </w:r>
-      <w:r>
-        <w:t>,</w:t>
-      </w:r>
-      <w:r>
-        <w:t xml:space="preserve"> а также их реализацией в языке </w:t>
-      </w:r>
-      <w:r>
-        <w:rPr>
-          <w:lang w:val="en-US"/>
-        </w:rPr>
-        <w:t>Java</w:t>
-      </w:r>
-      <w:r>
-        <w:t>.</w:t>
-      </w:r>
-    </w:p>
-    <w:p/>
-    <w:p/>
-    <w:p/>
-    <w:p/>
-    <w:p/>
-    <w:p/>
-    <w:p/>
-    <w:p/>
-    <w:p/>
-    <w:p/>
-    <w:p/>
-    <w:p/>
-    <w:p/>
-    <w:p/>
-    <w:p/>
-    <w:p/>
-    <w:p/>
-    <w:p/>
     <w:p>
       <w:pPr>
         <w:pStyle w:val="Heading1"/>
@@ -3166,12 +3505,13 @@
           <w:bCs/>
         </w:rPr>
       </w:pPr>
-      <w:bookmarkStart w:id="3" w:name="_Toc209088595"/>
+      <w:bookmarkStart w:id="6" w:name="_Toc210854125"/>
       <w:r>
         <w:rPr>
           <w:b/>
           <w:bCs/>
         </w:rPr>
+        <w:lastRenderedPageBreak/>
         <w:t xml:space="preserve">Список </w:t>
       </w:r>
       <w:r>
@@ -3181,7 +3521,7 @@
         </w:rPr>
         <w:t>источников</w:t>
       </w:r>
-      <w:bookmarkEnd w:id="3"/>
+      <w:bookmarkEnd w:id="6"/>
     </w:p>
     <w:p>
       <w:pPr>
@@ -3276,7 +3616,7 @@
       <w:r>
         <w:t xml:space="preserve">Java. Видеокурс [Электронный ресурс]. – Режим доступа: </w:t>
       </w:r>
-      <w:hyperlink r:id="rId12" w:history="1">
+      <w:hyperlink r:id="rId14" w:history="1">
         <w:r>
           <w:rPr>
             <w:rStyle w:val="Hyperlink"/>
@@ -3291,7 +3631,7 @@
     <w:p/>
     <w:p/>
     <w:sectPr>
-      <w:footerReference w:type="default" r:id="rId13"/>
+      <w:footerReference w:type="default" r:id="rId15"/>
       <w:pgSz w:w="11906" w:h="16838" w:code="9"/>
       <w:pgMar w:top="1134" w:right="851" w:bottom="1134" w:left="1701" w:header="709" w:footer="709" w:gutter="0"/>
       <w:cols w:space="708"/>

</xml_diff>

<commit_message>
IT lab4: additional task2
</commit_message>
<xml_diff>
--- a/programming/lab2/report.docx
+++ b/programming/lab2/report.docx
@@ -4,6 +4,7 @@
   <w:body>
     <w:p>
       <w:pPr>
+        <w:ind w:left="708" w:firstLine="708"/>
         <w:jc w:val="center"/>
         <w:rPr>
           <w:szCs w:val="28"/>
@@ -63,7 +64,6 @@
           <w:bCs/>
           <w:sz w:val="40"/>
           <w:szCs w:val="40"/>
-          <w:lang w:val="en-US"/>
         </w:rPr>
       </w:pPr>
       <w:r>
@@ -81,7 +81,6 @@
           <w:bCs/>
           <w:sz w:val="40"/>
           <w:szCs w:val="40"/>
-          <w:lang w:val="en-US"/>
         </w:rPr>
         <w:t xml:space="preserve"> </w:t>
       </w:r>
@@ -100,7 +99,6 @@
           <w:bCs/>
           <w:sz w:val="40"/>
           <w:szCs w:val="40"/>
-          <w:lang w:val="en-US"/>
         </w:rPr>
         <w:t xml:space="preserve"> 2</w:t>
       </w:r>
@@ -111,7 +109,6 @@
         <w:rPr>
           <w:b/>
           <w:bCs/>
-          <w:lang w:val="en-US"/>
         </w:rPr>
       </w:pPr>
       <w:r>
@@ -125,7 +122,6 @@
         <w:rPr>
           <w:b/>
           <w:bCs/>
-          <w:lang w:val="en-US"/>
         </w:rPr>
         <w:t>593186</w:t>
       </w:r>
@@ -1187,7 +1183,6 @@
         <w:rPr>
           <w:b/>
           <w:bCs/>
-          <w:lang w:val="en-US"/>
         </w:rPr>
       </w:pPr>
       <w:bookmarkStart w:id="1" w:name="_Toc210854120"/>
@@ -1259,19 +1254,7 @@
           <w:rPr>
             <w:rStyle w:val="Hyperlink"/>
           </w:rPr>
-          <w:t>/lab</w:t>
-        </w:r>
-        <w:r>
-          <w:rPr>
-            <w:rStyle w:val="Hyperlink"/>
-          </w:rPr>
-          <w:t>2</w:t>
-        </w:r>
-        <w:r>
-          <w:rPr>
-            <w:rStyle w:val="Hyperlink"/>
-          </w:rPr>
-          <w:t>/</w:t>
+          <w:t>/lab2/</w:t>
         </w:r>
         <w:proofErr w:type="spellStart"/>
         <w:r>
@@ -1543,6 +1526,7 @@
           <w:iCs/>
           <w:sz w:val="18"/>
           <w:szCs w:val="18"/>
+          <w:lang w:val="en-US"/>
         </w:rPr>
       </w:pPr>
       <w:r>
@@ -1552,7 +1536,17 @@
           <w:sz w:val="18"/>
           <w:szCs w:val="18"/>
         </w:rPr>
-        <w:t>Рисунок 5</w:t>
+        <w:t>Рисунок</w:t>
+      </w:r>
+      <w:r>
+        <w:rPr>
+          <w:i/>
+          <w:iCs/>
+          <w:sz w:val="18"/>
+          <w:szCs w:val="18"/>
+          <w:lang w:val="en-US"/>
+        </w:rPr>
+        <w:t xml:space="preserve"> 5</w:t>
       </w:r>
     </w:p>
     <w:p>
@@ -3420,7 +3414,13 @@
         </w:rPr>
       </w:pPr>
     </w:p>
-    <w:p/>
+    <w:p>
+      <w:pPr>
+        <w:rPr>
+          <w:lang w:val="en-US"/>
+        </w:rPr>
+      </w:pPr>
+    </w:p>
     <w:p>
       <w:pPr>
         <w:pStyle w:val="Heading1"/>
@@ -3677,6 +3677,7 @@
         <w:docPartUnique/>
       </w:docPartObj>
     </w:sdtPr>
+    <w:sdtEndPr/>
     <w:sdtContent>
       <w:p>
         <w:pPr>
@@ -4911,6 +4912,7 @@
   <w:style w:type="character" w:default="1" w:styleId="DefaultParagraphFont">
     <w:name w:val="Default Paragraph Font"/>
     <w:uiPriority w:val="1"/>
+    <w:semiHidden/>
     <w:unhideWhenUsed/>
   </w:style>
   <w:style w:type="table" w:default="1" w:styleId="TableNormal">

</xml_diff>